<commit_message>
Adding Chapter 1 to the book.
</commit_message>
<xml_diff>
--- a/Book/Deep Learning From Scratch in C++.docx
+++ b/Book/Deep Learning From Scratch in C++.docx
@@ -37,7 +37,7 @@
                     </pic:cNvPicPr>
                   </pic:nvPicPr>
                   <pic:blipFill>
-                    <a:blip r:embed="rId7">
+                    <a:blip r:embed="rId8">
                       <a:extLst>
                         <a:ext uri="{28A0092B-C50C-407E-A947-70E740481C1C}">
                           <a14:useLocalDpi xmlns:a14="http://schemas.microsoft.com/office/drawing/2010/main" val="0"/>
@@ -280,13 +280,8 @@
         <w:jc w:val="both"/>
       </w:pPr>
       <w:r>
-        <w:t>[</w:t>
-      </w:r>
-      <w:proofErr w:type="gramStart"/>
-      <w:r>
-        <w:t>Publisher ]</w:t>
-      </w:r>
-      <w:proofErr w:type="gramEnd"/>
+        <w:t>[Publisher ]</w:t>
+      </w:r>
     </w:p>
     <w:p>
       <w:pPr>
@@ -455,15 +450,7 @@
         <w:jc w:val="both"/>
       </w:pPr>
       <w:r>
-        <w:t xml:space="preserve">**Clarity**: No hidden </w:t>
-      </w:r>
-      <w:proofErr w:type="spellStart"/>
-      <w:r>
-        <w:t>autograd</w:t>
-      </w:r>
-      <w:proofErr w:type="spellEnd"/>
-      <w:r>
-        <w:t xml:space="preserve"> magic. Every gradient and weight update is explicit.</w:t>
+        <w:t>**Clarity**: No hidden autograd magic. Every gradient and weight update is explicit.</w:t>
       </w:r>
     </w:p>
     <w:p>
@@ -511,18 +498,10 @@
         <w:jc w:val="both"/>
       </w:pPr>
       <w:r>
-        <w:t>This is a **builder’s guide*</w:t>
-      </w:r>
-      <w:proofErr w:type="gramStart"/>
-      <w:r>
-        <w:t>*</w:t>
-      </w:r>
-      <w:r>
-        <w:t xml:space="preserve"> ,</w:t>
-      </w:r>
-      <w:proofErr w:type="gramEnd"/>
-      <w:r>
-        <w:t xml:space="preserve"> </w:t>
+        <w:t>This is a **builder’s guide**</w:t>
+      </w:r>
+      <w:r>
+        <w:t xml:space="preserve"> , </w:t>
       </w:r>
       <w:r>
         <w:t xml:space="preserve"> the story of how we sit down and construct deep learning from first principles.</w:t>
@@ -870,11 +849,1230 @@
     </w:p>
     <w:p>
       <w:pPr>
+        <w:spacing w:after="80"/>
+      </w:pPr>
+      <w:r>
+        <w:rPr>
+          <w:rFonts w:ascii="Arial" w:eastAsia="Arial" w:hAnsi="Arial" w:cs="Arial"/>
+          <w:b/>
+          <w:bCs/>
+          <w:caps/>
+          <w:color w:val="2E75B6"/>
+          <w:spacing w:val="120"/>
+          <w:sz w:val="22"/>
+          <w:szCs w:val="22"/>
+        </w:rPr>
+        <w:lastRenderedPageBreak/>
+        <w:t>Chapter 1</w:t>
+      </w:r>
+    </w:p>
+    <w:p>
+      <w:pPr>
+        <w:pBdr>
+          <w:bottom w:val="single" w:sz="6" w:space="6" w:color="2E75B6"/>
+        </w:pBdr>
+        <w:spacing w:before="80" w:after="480"/>
+      </w:pPr>
+      <w:r>
+        <w:rPr>
+          <w:rFonts w:ascii="Georgia" w:eastAsia="Georgia" w:hAnsi="Georgia" w:cs="Georgia"/>
+          <w:b/>
+          <w:bCs/>
+          <w:color w:val="1F3864"/>
+          <w:sz w:val="52"/>
+          <w:szCs w:val="52"/>
+        </w:rPr>
+        <w:t>Why Build Neural Networks from Scratch?</w:t>
+      </w:r>
+    </w:p>
+    <w:p>
+      <w:pPr>
+        <w:pBdr>
+          <w:left w:val="single" w:sz="18" w:space="12" w:color="2E75B6"/>
+        </w:pBdr>
+        <w:spacing w:before="180" w:after="180"/>
+        <w:ind w:left="720" w:right="720"/>
+      </w:pPr>
+      <w:r>
+        <w:rPr>
+          <w:rFonts w:ascii="Georgia" w:eastAsia="Georgia" w:hAnsi="Georgia" w:cs="Georgia"/>
+          <w:i/>
+          <w:iCs/>
+          <w:color w:val="555555"/>
+        </w:rPr>
+        <w:t>“What I cannot create, I do not understand.” — Richard Feynman</w:t>
+      </w:r>
+    </w:p>
+    <w:p>
+      <w:pPr>
+        <w:spacing w:after="240"/>
+      </w:pPr>
+    </w:p>
+    <w:p>
+      <w:pPr>
+        <w:pStyle w:val="Heading2"/>
+      </w:pPr>
+      <w:r>
+        <w:rPr>
+          <w:rFonts w:ascii="Arial" w:eastAsia="Arial" w:hAnsi="Arial" w:cs="Arial"/>
+          <w:b/>
+          <w:bCs/>
+          <w:color w:val="2E75B6"/>
+          <w:sz w:val="28"/>
+          <w:szCs w:val="28"/>
+        </w:rPr>
+        <w:t>1.1 The Allure and the Trap of Modern Frameworks</w:t>
+      </w:r>
+    </w:p>
+    <w:p>
+      <w:pPr>
+        <w:spacing w:after="180"/>
+        <w:jc w:val="both"/>
+      </w:pPr>
+      <w:r>
+        <w:rPr>
+          <w:rFonts w:ascii="Georgia" w:eastAsia="Georgia" w:hAnsi="Georgia" w:cs="Georgia"/>
+          <w:color w:val="1A1A1A"/>
+        </w:rPr>
+        <w:t xml:space="preserve">In 2026, building a neural network has never been easier. A handful of lines of Python </w:t>
+      </w:r>
+      <w:r>
+        <w:rPr>
+          <w:rFonts w:ascii="Georgia" w:eastAsia="Georgia" w:hAnsi="Georgia" w:cs="Georgia"/>
+          <w:color w:val="1A1A1A"/>
+        </w:rPr>
+        <w:t xml:space="preserve">, </w:t>
+      </w:r>
+      <w:r>
+        <w:rPr>
+          <w:rFonts w:ascii="Georgia" w:eastAsia="Georgia" w:hAnsi="Georgia" w:cs="Georgia"/>
+          <w:color w:val="1A1A1A"/>
+        </w:rPr>
+        <w:t xml:space="preserve"> a </w:t>
+      </w:r>
+      <w:r>
+        <w:rPr>
+          <w:rFonts w:ascii="Courier New" w:eastAsia="Courier New" w:hAnsi="Courier New" w:cs="Courier New"/>
+          <w:color w:val="2E4057"/>
+          <w:sz w:val="22"/>
+          <w:szCs w:val="22"/>
+        </w:rPr>
+        <w:t>torch.nn.Sequential</w:t>
+      </w:r>
+      <w:r>
+        <w:rPr>
+          <w:rFonts w:ascii="Georgia" w:eastAsia="Georgia" w:hAnsi="Georgia" w:cs="Georgia"/>
+          <w:color w:val="1A1A1A"/>
+        </w:rPr>
+        <w:t xml:space="preserve"> here, a </w:t>
+      </w:r>
+      <w:r>
+        <w:rPr>
+          <w:rFonts w:ascii="Courier New" w:eastAsia="Courier New" w:hAnsi="Courier New" w:cs="Courier New"/>
+          <w:color w:val="2E4057"/>
+          <w:sz w:val="22"/>
+          <w:szCs w:val="22"/>
+        </w:rPr>
+        <w:t>model.fit()</w:t>
+      </w:r>
+      <w:r>
+        <w:rPr>
+          <w:rFonts w:ascii="Georgia" w:eastAsia="Georgia" w:hAnsi="Georgia" w:cs="Georgia"/>
+          <w:color w:val="1A1A1A"/>
+        </w:rPr>
+        <w:t xml:space="preserve"> there</w:t>
+      </w:r>
+      <w:r>
+        <w:rPr>
+          <w:rFonts w:ascii="Georgia" w:eastAsia="Georgia" w:hAnsi="Georgia" w:cs="Georgia"/>
+          <w:color w:val="1A1A1A"/>
+        </w:rPr>
+        <w:t>,</w:t>
+      </w:r>
+      <w:r>
+        <w:rPr>
+          <w:rFonts w:ascii="Georgia" w:eastAsia="Georgia" w:hAnsi="Georgia" w:cs="Georgia"/>
+          <w:color w:val="1A1A1A"/>
+        </w:rPr>
+        <w:t xml:space="preserve"> and you have a working classifier trained on a GPU you rent by the hour. The convenience is extraordinary, and the results can be genuinely impressive.</w:t>
+      </w:r>
+    </w:p>
+    <w:p>
+      <w:pPr>
+        <w:spacing w:after="180"/>
+        <w:jc w:val="both"/>
+      </w:pPr>
+      <w:r>
+        <w:rPr>
+          <w:rFonts w:ascii="Georgia" w:eastAsia="Georgia" w:hAnsi="Georgia" w:cs="Georgia"/>
+          <w:color w:val="1A1A1A"/>
+        </w:rPr>
+        <w:t xml:space="preserve">But convenience has a shadow side. When that model fails to converge, when gradients vanish inexplicably, when inference is mysteriously slow, or when a small change to the architecture produces wildly different results — most practitioners can only reach for the same handful of remedies: adjust the learning rate, try a different optimizer, swap in batch normalization, and hope. The </w:t>
+      </w:r>
+      <w:r>
+        <w:rPr>
+          <w:rFonts w:ascii="Georgia" w:eastAsia="Georgia" w:hAnsi="Georgia" w:cs="Georgia"/>
+          <w:i/>
+          <w:iCs/>
+          <w:color w:val="1A1A1A"/>
+        </w:rPr>
+        <w:t>why</w:t>
+      </w:r>
+      <w:r>
+        <w:rPr>
+          <w:rFonts w:ascii="Georgia" w:eastAsia="Georgia" w:hAnsi="Georgia" w:cs="Georgia"/>
+          <w:color w:val="1A1A1A"/>
+        </w:rPr>
+        <w:t xml:space="preserve"> of the problem stays hidden.</w:t>
+      </w:r>
+    </w:p>
+    <w:p>
+      <w:pPr>
+        <w:spacing w:after="180"/>
+        <w:jc w:val="both"/>
+      </w:pPr>
+      <w:r>
+        <w:rPr>
+          <w:rFonts w:ascii="Georgia" w:eastAsia="Georgia" w:hAnsi="Georgia" w:cs="Georgia"/>
+          <w:b/>
+          <w:bCs/>
+          <w:color w:val="1A1A1A"/>
+        </w:rPr>
+        <w:t>We have become users of magic rather than its creators.</w:t>
+      </w:r>
+    </w:p>
+    <w:p>
+      <w:pPr>
+        <w:spacing w:after="180"/>
+        <w:jc w:val="both"/>
+      </w:pPr>
+      <w:r>
+        <w:rPr>
+          <w:rFonts w:ascii="Georgia" w:eastAsia="Georgia" w:hAnsi="Georgia" w:cs="Georgia"/>
+          <w:color w:val="1A1A1A"/>
+        </w:rPr>
+        <w:t>This is not a criticism of PyTorch or TensorFlow. Those frameworks are engineering triumphs. But they are tools optimized for productivity, and productivity-oriented tools necessarily abstract away the details. The autograd engine that silently differentiates your computation graph is a marvel</w:t>
+      </w:r>
+      <w:r>
+        <w:rPr>
+          <w:rFonts w:ascii="Georgia" w:eastAsia="Georgia" w:hAnsi="Georgia" w:cs="Georgia"/>
+          <w:color w:val="1A1A1A"/>
+        </w:rPr>
+        <w:t>,</w:t>
+      </w:r>
+      <w:r>
+        <w:rPr>
+          <w:rFonts w:ascii="Georgia" w:eastAsia="Georgia" w:hAnsi="Georgia" w:cs="Georgia"/>
+          <w:color w:val="1A1A1A"/>
+        </w:rPr>
+        <w:t xml:space="preserve"> and also a black box. The moment you need to step outside the happy path, that black box becomes a wall.</w:t>
+      </w:r>
+    </w:p>
+    <w:p>
+      <w:pPr>
+        <w:spacing w:after="180"/>
+        <w:jc w:val="both"/>
+      </w:pPr>
+      <w:r>
+        <w:rPr>
+          <w:rFonts w:ascii="Georgia" w:eastAsia="Georgia" w:hAnsi="Georgia" w:cs="Georgia"/>
+          <w:color w:val="1A1A1A"/>
+        </w:rPr>
+        <w:t xml:space="preserve">This book is written for those who want to dismantle the wall. Not to avoid frameworks </w:t>
+      </w:r>
+      <w:r>
+        <w:rPr>
+          <w:rFonts w:ascii="Georgia" w:eastAsia="Georgia" w:hAnsi="Georgia" w:cs="Georgia"/>
+          <w:color w:val="1A1A1A"/>
+        </w:rPr>
+        <w:t>,</w:t>
+      </w:r>
+      <w:r>
+        <w:rPr>
+          <w:rFonts w:ascii="Georgia" w:eastAsia="Georgia" w:hAnsi="Georgia" w:cs="Georgia"/>
+          <w:color w:val="1A1A1A"/>
+        </w:rPr>
+        <w:t xml:space="preserve"> you will still use them in your day-to-day work</w:t>
+      </w:r>
+      <w:r>
+        <w:rPr>
+          <w:rFonts w:ascii="Georgia" w:eastAsia="Georgia" w:hAnsi="Georgia" w:cs="Georgia"/>
+          <w:color w:val="1A1A1A"/>
+        </w:rPr>
+        <w:t xml:space="preserve">, </w:t>
+      </w:r>
+      <w:r>
+        <w:rPr>
+          <w:rFonts w:ascii="Georgia" w:eastAsia="Georgia" w:hAnsi="Georgia" w:cs="Georgia"/>
+          <w:color w:val="1A1A1A"/>
+        </w:rPr>
+        <w:t>but to understand what is behind them, so that when something goes wrong, you know exactly where to look.</w:t>
+      </w:r>
+    </w:p>
+    <w:p>
+      <w:pPr>
+        <w:pStyle w:val="Heading2"/>
+      </w:pPr>
+      <w:r>
+        <w:rPr>
+          <w:rFonts w:ascii="Arial" w:eastAsia="Arial" w:hAnsi="Arial" w:cs="Arial"/>
+          <w:b/>
+          <w:bCs/>
+          <w:color w:val="2E75B6"/>
+          <w:sz w:val="28"/>
+          <w:szCs w:val="28"/>
+        </w:rPr>
+        <w:t>1.2 What “From Scratch” Really Means</w:t>
+      </w:r>
+    </w:p>
+    <w:p>
+      <w:pPr>
+        <w:spacing w:after="180"/>
+        <w:jc w:val="both"/>
+      </w:pPr>
+      <w:r>
+        <w:rPr>
+          <w:rFonts w:ascii="Georgia" w:eastAsia="Georgia" w:hAnsi="Georgia" w:cs="Georgia"/>
+          <w:color w:val="1A1A1A"/>
+        </w:rPr>
+        <w:t>The phrase “from scratch” is sometimes used loosely, so let us be precise about what it means in this book.</w:t>
+      </w:r>
+    </w:p>
+    <w:p>
+      <w:pPr>
+        <w:spacing w:after="180"/>
+        <w:jc w:val="both"/>
+      </w:pPr>
+      <w:r>
+        <w:rPr>
+          <w:rFonts w:ascii="Georgia" w:eastAsia="Georgia" w:hAnsi="Georgia" w:cs="Georgia"/>
+          <w:color w:val="1A1A1A"/>
+        </w:rPr>
+        <w:t xml:space="preserve">We will </w:t>
+      </w:r>
+      <w:r>
+        <w:rPr>
+          <w:rFonts w:ascii="Georgia" w:eastAsia="Georgia" w:hAnsi="Georgia" w:cs="Georgia"/>
+          <w:i/>
+          <w:iCs/>
+          <w:color w:val="1A1A1A"/>
+        </w:rPr>
+        <w:t>not</w:t>
+      </w:r>
+      <w:r>
+        <w:rPr>
+          <w:rFonts w:ascii="Georgia" w:eastAsia="Georgia" w:hAnsi="Georgia" w:cs="Georgia"/>
+          <w:color w:val="1A1A1A"/>
+        </w:rPr>
+        <w:t xml:space="preserve"> write everything with raw arrays and manual pointer arithmetic, although that is entirely possible in C++. Instead, we will build a clean, modern, and extensible neural network library using thoughtful object-oriented design and the C++ Standard Library</w:t>
+      </w:r>
+      <w:r>
+        <w:rPr>
+          <w:rFonts w:ascii="Georgia" w:eastAsia="Georgia" w:hAnsi="Georgia" w:cs="Georgia"/>
+          <w:color w:val="1A1A1A"/>
+        </w:rPr>
+        <w:t>,</w:t>
+      </w:r>
+      <w:r>
+        <w:rPr>
+          <w:rFonts w:ascii="Georgia" w:eastAsia="Georgia" w:hAnsi="Georgia" w:cs="Georgia"/>
+          <w:color w:val="1A1A1A"/>
+        </w:rPr>
+        <w:t xml:space="preserve"> nothing else. No Eigen. No BLAS. No external deep learning frameworks of any kind.</w:t>
+      </w:r>
+    </w:p>
+    <w:p>
+      <w:pPr>
+        <w:spacing w:after="180"/>
+        <w:jc w:val="both"/>
+      </w:pPr>
+      <w:r>
+        <w:rPr>
+          <w:rFonts w:ascii="Georgia" w:eastAsia="Georgia" w:hAnsi="Georgia" w:cs="Georgia"/>
+          <w:color w:val="1A1A1A"/>
+        </w:rPr>
+        <w:t xml:space="preserve">The library you build will be fully functional. By the end of the </w:t>
+      </w:r>
+      <w:r>
+        <w:rPr>
+          <w:rFonts w:ascii="Georgia" w:eastAsia="Georgia" w:hAnsi="Georgia" w:cs="Georgia"/>
+          <w:color w:val="1A1A1A"/>
+        </w:rPr>
+        <w:t>book,</w:t>
+      </w:r>
+      <w:r>
+        <w:rPr>
+          <w:rFonts w:ascii="Georgia" w:eastAsia="Georgia" w:hAnsi="Georgia" w:cs="Georgia"/>
+          <w:color w:val="1A1A1A"/>
+        </w:rPr>
+        <w:t xml:space="preserve"> it will include:</w:t>
+      </w:r>
+    </w:p>
+    <w:p>
+      <w:pPr>
+        <w:pStyle w:val="ListParagraph"/>
+        <w:numPr>
+          <w:ilvl w:val="0"/>
+          <w:numId w:val="8"/>
+        </w:numPr>
+        <w:spacing w:before="60" w:after="60" w:line="240" w:lineRule="auto"/>
+        <w:contextualSpacing w:val="0"/>
+      </w:pPr>
+    </w:p>
+    <w:p>
+      <w:pPr>
+        <w:pStyle w:val="ListParagraph"/>
+        <w:numPr>
+          <w:ilvl w:val="0"/>
+          <w:numId w:val="8"/>
+        </w:numPr>
+        <w:spacing w:before="60" w:after="60" w:line="240" w:lineRule="auto"/>
+        <w:contextualSpacing w:val="0"/>
+      </w:pPr>
+    </w:p>
+    <w:p>
+      <w:pPr>
+        <w:pStyle w:val="ListParagraph"/>
+        <w:numPr>
+          <w:ilvl w:val="0"/>
+          <w:numId w:val="8"/>
+        </w:numPr>
+        <w:spacing w:before="60" w:after="60" w:line="240" w:lineRule="auto"/>
+        <w:contextualSpacing w:val="0"/>
+      </w:pPr>
+    </w:p>
+    <w:p>
+      <w:pPr>
+        <w:pStyle w:val="ListParagraph"/>
+        <w:numPr>
+          <w:ilvl w:val="0"/>
+          <w:numId w:val="8"/>
+        </w:numPr>
+        <w:spacing w:before="60" w:after="60" w:line="240" w:lineRule="auto"/>
+        <w:contextualSpacing w:val="0"/>
+      </w:pPr>
+    </w:p>
+    <w:p>
+      <w:pPr>
+        <w:pStyle w:val="ListParagraph"/>
+        <w:numPr>
+          <w:ilvl w:val="0"/>
+          <w:numId w:val="8"/>
+        </w:numPr>
+        <w:spacing w:before="60" w:after="60" w:line="240" w:lineRule="auto"/>
+        <w:contextualSpacing w:val="0"/>
+      </w:pPr>
+    </w:p>
+    <w:p>
+      <w:pPr>
+        <w:pStyle w:val="ListParagraph"/>
+        <w:numPr>
+          <w:ilvl w:val="0"/>
+          <w:numId w:val="8"/>
+        </w:numPr>
+        <w:spacing w:before="60" w:after="60" w:line="240" w:lineRule="auto"/>
+        <w:contextualSpacing w:val="0"/>
+      </w:pPr>
+    </w:p>
+    <w:p>
+      <w:pPr>
+        <w:spacing w:after="60"/>
+      </w:pPr>
+    </w:p>
+    <w:p>
+      <w:pPr>
+        <w:spacing w:after="180"/>
+        <w:jc w:val="both"/>
+      </w:pPr>
+      <w:r>
+        <w:rPr>
+          <w:rFonts w:ascii="Georgia" w:eastAsia="Georgia" w:hAnsi="Georgia" w:cs="Georgia"/>
+          <w:color w:val="1A1A1A"/>
+        </w:rPr>
+        <w:t xml:space="preserve">Every component is written explicitly. There is no hidden autograd engine. When you call </w:t>
+      </w:r>
+      <w:r>
+        <w:rPr>
+          <w:rFonts w:ascii="Courier New" w:eastAsia="Courier New" w:hAnsi="Courier New" w:cs="Courier New"/>
+          <w:color w:val="2E4057"/>
+          <w:sz w:val="22"/>
+          <w:szCs w:val="22"/>
+        </w:rPr>
+        <w:t>backward()</w:t>
+      </w:r>
+      <w:r>
+        <w:rPr>
+          <w:rFonts w:ascii="Georgia" w:eastAsia="Georgia" w:hAnsi="Georgia" w:cs="Georgia"/>
+          <w:color w:val="1A1A1A"/>
+        </w:rPr>
+        <w:t>, you will see, line by line, how error signals propagate backward through the graph and how each weight is updated. This explicitness is the point. Opacity is comfortable; transparency is educational.</w:t>
+      </w:r>
+    </w:p>
+    <w:p>
+      <w:pPr>
+        <w:pStyle w:val="Heading2"/>
+      </w:pPr>
+      <w:r>
+        <w:rPr>
+          <w:rFonts w:ascii="Arial" w:eastAsia="Arial" w:hAnsi="Arial" w:cs="Arial"/>
+          <w:b/>
+          <w:bCs/>
+          <w:color w:val="2E75B6"/>
+          <w:sz w:val="28"/>
+          <w:szCs w:val="28"/>
+        </w:rPr>
+        <w:t>1.3 The Philosophy Behind This Book</w:t>
+      </w:r>
+    </w:p>
+    <w:p>
+      <w:pPr>
+        <w:spacing w:after="180"/>
+        <w:jc w:val="both"/>
+      </w:pPr>
+      <w:r>
+        <w:rPr>
+          <w:rFonts w:ascii="Georgia" w:eastAsia="Georgia" w:hAnsi="Georgia" w:cs="Georgia"/>
+          <w:color w:val="1A1A1A"/>
+        </w:rPr>
+        <w:t>There is a certain kind of understanding that only comes from building. You can read a hundred explanations of backpropagation</w:t>
+      </w:r>
+      <w:r>
+        <w:rPr>
+          <w:rFonts w:ascii="Georgia" w:eastAsia="Georgia" w:hAnsi="Georgia" w:cs="Georgia"/>
+          <w:color w:val="1A1A1A"/>
+        </w:rPr>
+        <w:t xml:space="preserve">, </w:t>
+      </w:r>
+      <w:r>
+        <w:rPr>
+          <w:rFonts w:ascii="Georgia" w:eastAsia="Georgia" w:hAnsi="Georgia" w:cs="Georgia"/>
+          <w:color w:val="1A1A1A"/>
+        </w:rPr>
+        <w:t>the chain rule, the computation graph, the flow of gradients backward through layers</w:t>
+      </w:r>
+      <w:r>
+        <w:rPr>
+          <w:rFonts w:ascii="Georgia" w:eastAsia="Georgia" w:hAnsi="Georgia" w:cs="Georgia"/>
+          <w:color w:val="1A1A1A"/>
+        </w:rPr>
+        <w:t xml:space="preserve">, </w:t>
+      </w:r>
+      <w:r>
+        <w:rPr>
+          <w:rFonts w:ascii="Georgia" w:eastAsia="Georgia" w:hAnsi="Georgia" w:cs="Georgia"/>
+          <w:color w:val="1A1A1A"/>
+        </w:rPr>
+        <w:t xml:space="preserve">and nod along to all of them. But the moment you sit down and </w:t>
+      </w:r>
+      <w:r>
+        <w:rPr>
+          <w:rFonts w:ascii="Georgia" w:eastAsia="Georgia" w:hAnsi="Georgia" w:cs="Georgia"/>
+          <w:color w:val="1A1A1A"/>
+        </w:rPr>
+        <w:t>implement</w:t>
+      </w:r>
+      <w:r>
+        <w:rPr>
+          <w:rFonts w:ascii="Georgia" w:eastAsia="Georgia" w:hAnsi="Georgia" w:cs="Georgia"/>
+          <w:color w:val="1A1A1A"/>
+        </w:rPr>
+        <w:t xml:space="preserve"> it, when you write the code that computes </w:t>
+      </w:r>
+      <w:r>
+        <w:rPr>
+          <w:rFonts w:ascii="Georgia" w:eastAsia="Georgia" w:hAnsi="Georgia" w:cs="Georgia"/>
+          <w:i/>
+          <w:iCs/>
+          <w:color w:val="1A1A1A"/>
+        </w:rPr>
+        <w:t>∂L/∂w</w:t>
+      </w:r>
+      <w:r>
+        <w:rPr>
+          <w:rFonts w:ascii="Georgia" w:eastAsia="Georgia" w:hAnsi="Georgia" w:cs="Georgia"/>
+          <w:color w:val="1A1A1A"/>
+        </w:rPr>
+        <w:t xml:space="preserve"> for a single neuron and watch the weight move in the right direction, something clicks that no explanation could have produced. The abstraction becomes concrete.</w:t>
+      </w:r>
+    </w:p>
+    <w:p>
+      <w:pPr>
+        <w:spacing w:after="180"/>
+        <w:jc w:val="both"/>
+      </w:pPr>
+      <w:r>
+        <w:rPr>
+          <w:rFonts w:ascii="Georgia" w:eastAsia="Georgia" w:hAnsi="Georgia" w:cs="Georgia"/>
+          <w:color w:val="1A1A1A"/>
+        </w:rPr>
+        <w:t xml:space="preserve">This book is built on that conviction. Its organizing principle is simple: </w:t>
+      </w:r>
+      <w:r>
+        <w:rPr>
+          <w:rFonts w:ascii="Georgia" w:eastAsia="Georgia" w:hAnsi="Georgia" w:cs="Georgia"/>
+          <w:b/>
+          <w:bCs/>
+          <w:color w:val="1A1A1A"/>
+        </w:rPr>
+        <w:t>the best way to understand something deeply is to build it yourself.</w:t>
+      </w:r>
+    </w:p>
+    <w:p>
+      <w:pPr>
+        <w:spacing w:after="180"/>
+        <w:jc w:val="both"/>
+      </w:pPr>
+      <w:r>
+        <w:rPr>
+          <w:rFonts w:ascii="Georgia" w:eastAsia="Georgia" w:hAnsi="Georgia" w:cs="Georgia"/>
+          <w:color w:val="1A1A1A"/>
+        </w:rPr>
+        <w:t>Building from first principles will give you three things that reading alone cannot:</w:t>
+      </w:r>
+    </w:p>
+    <w:p>
+      <w:pPr>
+        <w:spacing w:after="180"/>
+        <w:jc w:val="both"/>
+      </w:pPr>
+      <w:r>
+        <w:rPr>
+          <w:rFonts w:ascii="Georgia" w:eastAsia="Georgia" w:hAnsi="Georgia" w:cs="Georgia"/>
+          <w:b/>
+          <w:bCs/>
+          <w:color w:val="1A1A1A"/>
+        </w:rPr>
+        <w:t xml:space="preserve">Deep intuition. </w:t>
+      </w:r>
+      <w:r>
+        <w:rPr>
+          <w:rFonts w:ascii="Georgia" w:eastAsia="Georgia" w:hAnsi="Georgia" w:cs="Georgia"/>
+          <w:color w:val="1A1A1A"/>
+        </w:rPr>
+        <w:t>You will no longer think of backpropagation as an algorithm that happens inside the framework. You will think of it as a natural consequence of the chain rule, applied recursively through a graph you designed and wired yourself. That intuition travels with you to every framework you ever use.</w:t>
+      </w:r>
+    </w:p>
+    <w:p>
+      <w:pPr>
+        <w:spacing w:after="180"/>
+        <w:jc w:val="both"/>
+      </w:pPr>
+      <w:r>
+        <w:rPr>
+          <w:rFonts w:ascii="Georgia" w:eastAsia="Georgia" w:hAnsi="Georgia" w:cs="Georgia"/>
+          <w:b/>
+          <w:bCs/>
+          <w:color w:val="1A1A1A"/>
+        </w:rPr>
+        <w:t xml:space="preserve">Performance awareness. </w:t>
+      </w:r>
+      <w:r>
+        <w:rPr>
+          <w:rFonts w:ascii="Georgia" w:eastAsia="Georgia" w:hAnsi="Georgia" w:cs="Georgia"/>
+          <w:color w:val="1A1A1A"/>
+        </w:rPr>
+        <w:t>C++ forces you to think about memory. You will see exactly where allocations happen, where cache misses lurk, and which loops dominate runtime. This awareness makes you a better engineer even when you return to higher-level languages.</w:t>
+      </w:r>
+    </w:p>
+    <w:p>
+      <w:pPr>
+        <w:spacing w:after="180"/>
+        <w:jc w:val="both"/>
+      </w:pPr>
+      <w:r>
+        <w:rPr>
+          <w:rFonts w:ascii="Georgia" w:eastAsia="Georgia" w:hAnsi="Georgia" w:cs="Georgia"/>
+          <w:b/>
+          <w:bCs/>
+          <w:color w:val="1A1A1A"/>
+        </w:rPr>
+        <w:t xml:space="preserve">Confidence to extend and debug. </w:t>
+      </w:r>
+      <w:r>
+        <w:rPr>
+          <w:rFonts w:ascii="Georgia" w:eastAsia="Georgia" w:hAnsi="Georgia" w:cs="Georgia"/>
+          <w:color w:val="1A1A1A"/>
+        </w:rPr>
+        <w:t>When you have built a residual connection from scratch, debugging one in PyTorch is a fundamentally different experience. You are not staring at a black box; you are reading a familiar story in a different dialect.</w:t>
+      </w:r>
+    </w:p>
+    <w:p>
+      <w:pPr>
+        <w:pStyle w:val="Heading2"/>
+      </w:pPr>
+      <w:r>
+        <w:rPr>
+          <w:rFonts w:ascii="Arial" w:eastAsia="Arial" w:hAnsi="Arial" w:cs="Arial"/>
+          <w:b/>
+          <w:bCs/>
+          <w:color w:val="2E75B6"/>
+          <w:sz w:val="28"/>
+          <w:szCs w:val="28"/>
+        </w:rPr>
+        <w:t>1.4 The Running Project: A Natural Language Appliance Controller</w:t>
+      </w:r>
+    </w:p>
+    <w:p>
+      <w:pPr>
+        <w:spacing w:after="180"/>
+        <w:jc w:val="both"/>
+      </w:pPr>
+      <w:r>
+        <w:rPr>
+          <w:rFonts w:ascii="Georgia" w:eastAsia="Georgia" w:hAnsi="Georgia" w:cs="Georgia"/>
+          <w:color w:val="1A1A1A"/>
+        </w:rPr>
+        <w:t>A book about neural networks needs a real neural network to build toward. Abstract examples are useful for illustration, but there is no substitute for watching your own code learn something genuinely useful.</w:t>
+      </w:r>
+    </w:p>
+    <w:p>
+      <w:pPr>
+        <w:spacing w:after="180"/>
+        <w:jc w:val="both"/>
+      </w:pPr>
+      <w:r>
+        <w:rPr>
+          <w:rFonts w:ascii="Georgia" w:eastAsia="Georgia" w:hAnsi="Georgia" w:cs="Georgia"/>
+          <w:color w:val="1A1A1A"/>
+        </w:rPr>
+        <w:lastRenderedPageBreak/>
+        <w:t>Our running project throughout this book is a natural language appliance controller. Given commands in plain English such as:</w:t>
+      </w:r>
+    </w:p>
+    <w:p>
+      <w:pPr>
+        <w:pStyle w:val="ListParagraph"/>
+        <w:numPr>
+          <w:ilvl w:val="0"/>
+          <w:numId w:val="8"/>
+        </w:numPr>
+        <w:spacing w:before="60" w:after="60" w:line="240" w:lineRule="auto"/>
+        <w:contextualSpacing w:val="0"/>
+      </w:pPr>
+    </w:p>
+    <w:p>
+      <w:pPr>
+        <w:pStyle w:val="ListParagraph"/>
+        <w:numPr>
+          <w:ilvl w:val="0"/>
+          <w:numId w:val="8"/>
+        </w:numPr>
+        <w:spacing w:before="60" w:after="60" w:line="240" w:lineRule="auto"/>
+        <w:contextualSpacing w:val="0"/>
+      </w:pPr>
+    </w:p>
+    <w:p>
+      <w:pPr>
+        <w:pStyle w:val="ListParagraph"/>
+        <w:numPr>
+          <w:ilvl w:val="0"/>
+          <w:numId w:val="8"/>
+        </w:numPr>
+        <w:spacing w:before="60" w:after="60" w:line="240" w:lineRule="auto"/>
+        <w:contextualSpacing w:val="0"/>
+      </w:pPr>
+    </w:p>
+    <w:p>
+      <w:pPr>
+        <w:spacing w:after="60"/>
+      </w:pPr>
+    </w:p>
+    <w:p>
+      <w:pPr>
+        <w:spacing w:after="180"/>
+        <w:jc w:val="both"/>
+      </w:pPr>
+      <w:r>
+        <w:rPr>
+          <w:rFonts w:ascii="Georgia" w:eastAsia="Georgia" w:hAnsi="Georgia" w:cs="Georgia"/>
+          <w:color w:val="1A1A1A"/>
+        </w:rPr>
+        <w:t>the model will predict which appliances should be turned on or off. It is a multi-label classification problem, and solving it properly requires the full stack of techniques covered in this book: text tokenization, a vocabulary class, 1D convolutions over word sequences, and sigmoid outputs for independent per-appliance predictions.</w:t>
+      </w:r>
+    </w:p>
+    <w:p>
+      <w:pPr>
+        <w:spacing w:after="180"/>
+        <w:jc w:val="both"/>
+      </w:pPr>
+      <w:r>
+        <w:rPr>
+          <w:rFonts w:ascii="Georgia" w:eastAsia="Georgia" w:hAnsi="Georgia" w:cs="Georgia"/>
+          <w:color w:val="1A1A1A"/>
+        </w:rPr>
+        <w:t>The project is carefully chosen. It is complex enough to demonstrate real techniques in a realistic setting</w:t>
+      </w:r>
+      <w:r>
+        <w:rPr>
+          <w:rFonts w:ascii="Georgia" w:eastAsia="Georgia" w:hAnsi="Georgia" w:cs="Georgia"/>
+          <w:color w:val="1A1A1A"/>
+        </w:rPr>
+        <w:t>,</w:t>
+      </w:r>
+      <w:r>
+        <w:rPr>
+          <w:rFonts w:ascii="Georgia" w:eastAsia="Georgia" w:hAnsi="Georgia" w:cs="Georgia"/>
+          <w:color w:val="1A1A1A"/>
+        </w:rPr>
+        <w:t xml:space="preserve"> </w:t>
+      </w:r>
+      <w:r>
+        <w:rPr>
+          <w:rFonts w:ascii="Georgia" w:eastAsia="Georgia" w:hAnsi="Georgia" w:cs="Georgia"/>
+          <w:color w:val="1A1A1A"/>
+        </w:rPr>
+        <w:t xml:space="preserve"> </w:t>
+      </w:r>
+      <w:r>
+        <w:rPr>
+          <w:rFonts w:ascii="Georgia" w:eastAsia="Georgia" w:hAnsi="Georgia" w:cs="Georgia"/>
+          <w:color w:val="1A1A1A"/>
+        </w:rPr>
+        <w:t xml:space="preserve">it involves language, sequence </w:t>
+      </w:r>
+      <w:r>
+        <w:rPr>
+          <w:rFonts w:ascii="Georgia" w:eastAsia="Georgia" w:hAnsi="Georgia" w:cs="Georgia"/>
+          <w:color w:val="1A1A1A"/>
+        </w:rPr>
+        <w:t>modelling</w:t>
+      </w:r>
+      <w:r>
+        <w:rPr>
+          <w:rFonts w:ascii="Georgia" w:eastAsia="Georgia" w:hAnsi="Georgia" w:cs="Georgia"/>
+          <w:color w:val="1A1A1A"/>
+        </w:rPr>
+        <w:t xml:space="preserve">, and multi-label outputs </w:t>
+      </w:r>
+      <w:r>
+        <w:rPr>
+          <w:rFonts w:ascii="Georgia" w:eastAsia="Georgia" w:hAnsi="Georgia" w:cs="Georgia"/>
+          <w:color w:val="1A1A1A"/>
+        </w:rPr>
+        <w:t xml:space="preserve">, </w:t>
+      </w:r>
+      <w:r>
+        <w:rPr>
+          <w:rFonts w:ascii="Georgia" w:eastAsia="Georgia" w:hAnsi="Georgia" w:cs="Georgia"/>
+          <w:color w:val="1A1A1A"/>
+        </w:rPr>
+        <w:t>yet simple enough to train to convergence in seconds on a laptop CPU. You will see it working, and you will understand every layer of why it works.</w:t>
+      </w:r>
+    </w:p>
+    <w:p>
+      <w:pPr>
+        <w:spacing w:after="180"/>
+        <w:jc w:val="both"/>
+      </w:pPr>
+      <w:r>
+        <w:rPr>
+          <w:rFonts w:ascii="Georgia" w:eastAsia="Georgia" w:hAnsi="Georgia" w:cs="Georgia"/>
+          <w:color w:val="1A1A1A"/>
+        </w:rPr>
+        <w:t>We introduce pieces of the project gradually as each new concept is covered, so that by the time you reach Chapter 9, the full system feels like a natural culmination rather than a sudden leap.</w:t>
+      </w:r>
+    </w:p>
+    <w:p>
+      <w:pPr>
+        <w:pStyle w:val="Heading2"/>
+      </w:pPr>
+      <w:r>
+        <w:rPr>
+          <w:rFonts w:ascii="Arial" w:eastAsia="Arial" w:hAnsi="Arial" w:cs="Arial"/>
+          <w:b/>
+          <w:bCs/>
+          <w:color w:val="2E75B6"/>
+          <w:sz w:val="28"/>
+          <w:szCs w:val="28"/>
+        </w:rPr>
+        <w:t>1.5 Who This Book Is For</w:t>
+      </w:r>
+    </w:p>
+    <w:p>
+      <w:pPr>
+        <w:spacing w:after="180"/>
+        <w:jc w:val="both"/>
+      </w:pPr>
+      <w:r>
+        <w:rPr>
+          <w:rFonts w:ascii="Georgia" w:eastAsia="Georgia" w:hAnsi="Georgia" w:cs="Georgia"/>
+          <w:color w:val="1A1A1A"/>
+        </w:rPr>
+        <w:t>This book is written for people who already know how to write software and want to understand machine learning at a level most practitioners never reach. More specifically:</w:t>
+      </w:r>
+    </w:p>
+    <w:p>
+      <w:pPr>
+        <w:pStyle w:val="ListParagraph"/>
+        <w:numPr>
+          <w:ilvl w:val="0"/>
+          <w:numId w:val="8"/>
+        </w:numPr>
+        <w:spacing w:before="60" w:after="60" w:line="240" w:lineRule="auto"/>
+        <w:contextualSpacing w:val="0"/>
+      </w:pPr>
+    </w:p>
+    <w:p>
+      <w:pPr>
+        <w:pStyle w:val="ListParagraph"/>
+        <w:numPr>
+          <w:ilvl w:val="0"/>
+          <w:numId w:val="8"/>
+        </w:numPr>
+        <w:spacing w:before="60" w:after="60" w:line="240" w:lineRule="auto"/>
+        <w:contextualSpacing w:val="0"/>
+      </w:pPr>
+    </w:p>
+    <w:p>
+      <w:pPr>
+        <w:pStyle w:val="ListParagraph"/>
+        <w:numPr>
+          <w:ilvl w:val="0"/>
+          <w:numId w:val="8"/>
+        </w:numPr>
+        <w:spacing w:before="60" w:after="60" w:line="240" w:lineRule="auto"/>
+        <w:contextualSpacing w:val="0"/>
+      </w:pPr>
+    </w:p>
+    <w:p>
+      <w:pPr>
+        <w:pStyle w:val="ListParagraph"/>
+        <w:numPr>
+          <w:ilvl w:val="0"/>
+          <w:numId w:val="8"/>
+        </w:numPr>
+        <w:spacing w:before="60" w:after="60" w:line="240" w:lineRule="auto"/>
+        <w:contextualSpacing w:val="0"/>
+      </w:pPr>
+    </w:p>
+    <w:p>
+      <w:pPr>
+        <w:pStyle w:val="ListParagraph"/>
+        <w:numPr>
+          <w:ilvl w:val="0"/>
+          <w:numId w:val="8"/>
+        </w:numPr>
+        <w:spacing w:before="60" w:after="60" w:line="240" w:lineRule="auto"/>
+        <w:contextualSpacing w:val="0"/>
+      </w:pPr>
+    </w:p>
+    <w:p>
+      <w:pPr>
+        <w:spacing w:after="60"/>
+      </w:pPr>
+    </w:p>
+    <w:p>
+      <w:pPr>
+        <w:spacing w:after="180"/>
+        <w:jc w:val="both"/>
+      </w:pPr>
+      <w:r>
+        <w:rPr>
+          <w:rFonts w:ascii="Georgia" w:eastAsia="Georgia" w:hAnsi="Georgia" w:cs="Georgia"/>
+          <w:color w:val="1A1A1A"/>
+        </w:rPr>
+        <w:t>You should be comfortable with C++ classes, pointers, templates, and the Standard Template Library. No prior deep learning experience is required. The mathematics</w:t>
+      </w:r>
+      <w:r>
+        <w:rPr>
+          <w:rFonts w:ascii="Georgia" w:eastAsia="Georgia" w:hAnsi="Georgia" w:cs="Georgia"/>
+          <w:color w:val="1A1A1A"/>
+        </w:rPr>
+        <w:t xml:space="preserve">, </w:t>
+      </w:r>
+      <w:r>
+        <w:rPr>
+          <w:rFonts w:ascii="Georgia" w:eastAsia="Georgia" w:hAnsi="Georgia" w:cs="Georgia"/>
+          <w:color w:val="1A1A1A"/>
+        </w:rPr>
+        <w:t xml:space="preserve"> calculus, linear algebra, a touch of probability will be developed carefully as each concept is introduced. If you want a refresher, Appendix B provides a concise review.</w:t>
+      </w:r>
+    </w:p>
+    <w:p>
+      <w:pPr>
+        <w:pStyle w:val="Heading2"/>
+      </w:pPr>
+      <w:r>
+        <w:rPr>
+          <w:rFonts w:ascii="Arial" w:eastAsia="Arial" w:hAnsi="Arial" w:cs="Arial"/>
+          <w:b/>
+          <w:bCs/>
+          <w:color w:val="2E75B6"/>
+          <w:sz w:val="28"/>
+          <w:szCs w:val="28"/>
+        </w:rPr>
+        <w:t>1.6 How to Use This Book</w:t>
+      </w:r>
+    </w:p>
+    <w:p>
+      <w:pPr>
+        <w:spacing w:after="180"/>
+        <w:jc w:val="both"/>
+      </w:pPr>
+      <w:r>
+        <w:rPr>
+          <w:rFonts w:ascii="Georgia" w:eastAsia="Georgia" w:hAnsi="Georgia" w:cs="Georgia"/>
+          <w:color w:val="1A1A1A"/>
+        </w:rPr>
+        <w:t>The book is organized in three parts. Part I (Chapters 1–4) builds the foundations: from a single neuron to multi-layer networks and backpropagation. Part II (Chapters 5–8) introduces the components that make modern deep learning work in practice</w:t>
+      </w:r>
+      <w:r>
+        <w:rPr>
+          <w:rFonts w:ascii="Georgia" w:eastAsia="Georgia" w:hAnsi="Georgia" w:cs="Georgia"/>
+          <w:color w:val="1A1A1A"/>
+        </w:rPr>
+        <w:t xml:space="preserve">, </w:t>
+      </w:r>
+      <w:r>
+        <w:rPr>
+          <w:rFonts w:ascii="Georgia" w:eastAsia="Georgia" w:hAnsi="Georgia" w:cs="Georgia"/>
+          <w:color w:val="1A1A1A"/>
+        </w:rPr>
+        <w:t xml:space="preserve"> Adam, convolutions, regularization, and residual connections. Part III (Chapters 9–12) brings everything together in complete applications and looks ahead to what lies beyond.</w:t>
+      </w:r>
+    </w:p>
+    <w:p>
+      <w:pPr>
+        <w:spacing w:after="180"/>
+        <w:jc w:val="both"/>
+      </w:pPr>
+      <w:r>
+        <w:rPr>
+          <w:rFonts w:ascii="Georgia" w:eastAsia="Georgia" w:hAnsi="Georgia" w:cs="Georgia"/>
+          <w:color w:val="1A1A1A"/>
+        </w:rPr>
+        <w:lastRenderedPageBreak/>
+        <w:t>Each chapter follows the same rhythm: motivation and theory first, then implementation, then a working example you can compile and run immediately. The recommended workflow is to read the chapter, study the accompanying code in parallel, compile and run the examples, and then experiment. Change the architecture. Break the training loop on purpose and watch what happens. Curiosity-driven tinkering is far more instructive than passive reading.</w:t>
+      </w:r>
+    </w:p>
+    <w:p>
+      <w:pPr>
+        <w:spacing w:after="180"/>
+        <w:jc w:val="both"/>
+      </w:pPr>
+      <w:r>
+        <w:rPr>
+          <w:rFonts w:ascii="Georgia" w:eastAsia="Georgia" w:hAnsi="Georgia" w:cs="Georgia"/>
+          <w:color w:val="1A1A1A"/>
+        </w:rPr>
+        <w:t>The complete library can be compiled with a single command from the source directory:</w:t>
+      </w:r>
+    </w:p>
+    <w:p>
+      <w:pPr>
+        <w:shd w:val="clear" w:color="auto" w:fill="F0F4F8"/>
+        <w:spacing w:before="120" w:after="120"/>
+        <w:ind w:left="720"/>
+      </w:pPr>
+      <w:r>
+        <w:rPr>
+          <w:rFonts w:ascii="Courier New" w:eastAsia="Courier New" w:hAnsi="Courier New" w:cs="Courier New"/>
+          <w:color w:val="2E4057"/>
+          <w:sz w:val="22"/>
+          <w:szCs w:val="22"/>
+        </w:rPr>
+        <w:t>g++ -std=c++17 -O2 -o appliance *.cpp</w:t>
+      </w:r>
+    </w:p>
+    <w:p>
+      <w:pPr>
+        <w:spacing w:after="180"/>
+        <w:jc w:val="both"/>
+      </w:pPr>
+      <w:r>
+        <w:rPr>
+          <w:rFonts w:ascii="Georgia" w:eastAsia="Georgia" w:hAnsi="Georgia" w:cs="Georgia"/>
+          <w:color w:val="1A1A1A"/>
+        </w:rPr>
+        <w:t>No build system, no dependency manager, no CMake. One command, one binary. That simplicity is deliberate: we want nothing between you and the code.</w:t>
+      </w:r>
+    </w:p>
+    <w:p>
+      <w:pPr>
+        <w:pStyle w:val="Heading2"/>
+      </w:pPr>
+      <w:r>
+        <w:rPr>
+          <w:rFonts w:ascii="Arial" w:eastAsia="Arial" w:hAnsi="Arial" w:cs="Arial"/>
+          <w:b/>
+          <w:bCs/>
+          <w:color w:val="2E75B6"/>
+          <w:sz w:val="28"/>
+          <w:szCs w:val="28"/>
+        </w:rPr>
+        <w:t>1.7 What You Will Have Built by the End</w:t>
+      </w:r>
+    </w:p>
+    <w:p>
+      <w:pPr>
+        <w:spacing w:after="180"/>
+        <w:jc w:val="both"/>
+      </w:pPr>
+      <w:r>
+        <w:rPr>
+          <w:rFonts w:ascii="Georgia" w:eastAsia="Georgia" w:hAnsi="Georgia" w:cs="Georgia"/>
+          <w:color w:val="1A1A1A"/>
+        </w:rPr>
+        <w:t>By the final chapter, you will have a complete, production-capable neural network library implemented entirely in C++ with the Standard Library. It will support dense networks, 1D and 2D convolutional networks, residual architectures, and a working natural language model — all trained with the Adam optimizer.</w:t>
+      </w:r>
+    </w:p>
+    <w:p>
+      <w:pPr>
+        <w:spacing w:after="180"/>
+        <w:jc w:val="both"/>
+      </w:pPr>
+      <w:r>
+        <w:rPr>
+          <w:rFonts w:ascii="Georgia" w:eastAsia="Georgia" w:hAnsi="Georgia" w:cs="Georgia"/>
+          <w:color w:val="1A1A1A"/>
+        </w:rPr>
+        <w:t xml:space="preserve">More importantly, you will understand </w:t>
+      </w:r>
+      <w:r>
+        <w:rPr>
+          <w:rFonts w:ascii="Georgia" w:eastAsia="Georgia" w:hAnsi="Georgia" w:cs="Georgia"/>
+          <w:i/>
+          <w:iCs/>
+          <w:color w:val="1A1A1A"/>
+        </w:rPr>
+        <w:t>why</w:t>
+      </w:r>
+      <w:r>
+        <w:rPr>
+          <w:rFonts w:ascii="Georgia" w:eastAsia="Georgia" w:hAnsi="Georgia" w:cs="Georgia"/>
+          <w:color w:val="1A1A1A"/>
+        </w:rPr>
+        <w:t xml:space="preserve"> each component exists. Not at the level of “residual connections help gradients flow,” but at the level of the exact lines of code that make it true. That understanding will make you a better machine learning engineer, a better C++ programmer, and perhaps most valuably a more confident and independent thinker when you encounter something new.</w:t>
+      </w:r>
+    </w:p>
+    <w:p>
+      <w:pPr>
+        <w:spacing w:after="180"/>
+        <w:jc w:val="both"/>
+      </w:pPr>
+      <w:r>
+        <w:rPr>
+          <w:rFonts w:ascii="Georgia" w:eastAsia="Georgia" w:hAnsi="Georgia" w:cs="Georgia"/>
+          <w:color w:val="1A1A1A"/>
+        </w:rPr>
+        <w:t>Let us begin.</w:t>
+      </w:r>
+    </w:p>
+    <w:p>
+      <w:pPr>
+        <w:spacing w:after="180"/>
+        <w:jc w:val="both"/>
+      </w:pPr>
+    </w:p>
+    <w:p>
+      <w:pPr>
+        <w:pBdr>
+          <w:top w:val="single" w:sz="6" w:space="4" w:color="2E75B6"/>
+          <w:left w:val="single" w:sz="6" w:space="4" w:color="2E75B6"/>
+          <w:bottom w:val="single" w:sz="6" w:space="4" w:color="2E75B6"/>
+          <w:right w:val="single" w:sz="6" w:space="4" w:color="2E75B6"/>
+        </w:pBdr>
+        <w:shd w:val="clear" w:color="auto" w:fill="EBF2FA"/>
+        <w:spacing w:before="120" w:after="60"/>
+        <w:ind w:left="240" w:right="240"/>
+      </w:pPr>
+      <w:r>
+        <w:rPr>
+          <w:rFonts w:ascii="Arial" w:eastAsia="Arial" w:hAnsi="Arial" w:cs="Arial"/>
+          <w:b/>
+          <w:bCs/>
+          <w:color w:val="1F3864"/>
+        </w:rPr>
+        <w:t>Chapter Summary</w:t>
+      </w:r>
+    </w:p>
+    <w:p>
+      <w:pPr>
+        <w:pStyle w:val="ListParagraph"/>
+        <w:numPr>
+          <w:ilvl w:val="0"/>
+          <w:numId w:val="8"/>
+        </w:numPr>
+        <w:shd w:val="clear" w:color="auto" w:fill="EBF2FA"/>
+        <w:spacing w:before="60" w:after="60" w:line="240" w:lineRule="auto"/>
+        <w:ind w:left="960"/>
+        <w:contextualSpacing w:val="0"/>
+      </w:pPr>
+      <w:r>
+        <w:rPr>
+          <w:rFonts w:ascii="Georgia" w:eastAsia="Georgia" w:hAnsi="Georgia" w:cs="Georgia"/>
+          <w:color w:val="1A1A1A"/>
+        </w:rPr>
+        <w:t>Modern frameworks hide the details that matter most when things go wrong.</w:t>
+      </w:r>
+    </w:p>
+    <w:p>
+      <w:pPr>
+        <w:pStyle w:val="ListParagraph"/>
+        <w:numPr>
+          <w:ilvl w:val="0"/>
+          <w:numId w:val="8"/>
+        </w:numPr>
+        <w:shd w:val="clear" w:color="auto" w:fill="EBF2FA"/>
+        <w:spacing w:before="60" w:after="60" w:line="240" w:lineRule="auto"/>
+        <w:ind w:left="960"/>
+        <w:contextualSpacing w:val="0"/>
+      </w:pPr>
+      <w:r>
+        <w:rPr>
+          <w:rFonts w:ascii="Georgia" w:eastAsia="Georgia" w:hAnsi="Georgia" w:cs="Georgia"/>
+          <w:color w:val="1A1A1A"/>
+        </w:rPr>
+        <w:t>This book builds a complete neural network library from scratch in C++17, using only the Standard Library.</w:t>
+      </w:r>
+    </w:p>
+    <w:p>
+      <w:pPr>
+        <w:pStyle w:val="ListParagraph"/>
+        <w:numPr>
+          <w:ilvl w:val="0"/>
+          <w:numId w:val="8"/>
+        </w:numPr>
+        <w:shd w:val="clear" w:color="auto" w:fill="EBF2FA"/>
+        <w:spacing w:before="60" w:after="60" w:line="240" w:lineRule="auto"/>
+        <w:ind w:left="960"/>
+        <w:contextualSpacing w:val="0"/>
+      </w:pPr>
+      <w:r>
+        <w:rPr>
+          <w:rFonts w:ascii="Georgia" w:eastAsia="Georgia" w:hAnsi="Georgia" w:cs="Georgia"/>
+          <w:color w:val="1A1A1A"/>
+        </w:rPr>
+        <w:t>The running project — a natural language appliance controller — provides a concrete, trainable target throughout.</w:t>
+      </w:r>
+    </w:p>
+    <w:p>
+      <w:pPr>
+        <w:pStyle w:val="ListParagraph"/>
+        <w:numPr>
+          <w:ilvl w:val="0"/>
+          <w:numId w:val="8"/>
+        </w:numPr>
+        <w:shd w:val="clear" w:color="auto" w:fill="EBF2FA"/>
+        <w:spacing w:before="60" w:after="120" w:line="240" w:lineRule="auto"/>
+        <w:ind w:left="960"/>
+        <w:contextualSpacing w:val="0"/>
+      </w:pPr>
+      <w:r>
+        <w:rPr>
+          <w:rFonts w:ascii="Georgia" w:eastAsia="Georgia" w:hAnsi="Georgia" w:cs="Georgia"/>
+          <w:color w:val="1A1A1A"/>
+        </w:rPr>
+        <w:t>Building from first principles develops intuition that no framework tutorial can provide.</w:t>
+      </w:r>
+    </w:p>
+    <w:p>
+      <w:pPr>
         <w:jc w:val="both"/>
       </w:pPr>
     </w:p>
     <w:sectPr>
-      <w:footerReference w:type="default" r:id="rId8"/>
+      <w:footerReference w:type="default" r:id="rId9"/>
       <w:pgSz w:w="11906" w:h="16838"/>
       <w:pgMar w:top="1440" w:right="1440" w:bottom="1440" w:left="1440" w:header="708" w:footer="708" w:gutter="0"/>
       <w:cols w:space="708"/>
@@ -955,6 +2153,1099 @@
     </w:p>
   </w:footnote>
 </w:footnotes>
+</file>
+
+<file path=word/numbering.xml><?xml version="1.0" encoding="utf-8"?>
+<w:numbering xmlns:wpc="http://schemas.microsoft.com/office/word/2010/wordprocessingCanvas" xmlns:cx="http://schemas.microsoft.com/office/drawing/2014/chartex" xmlns:cx1="http://schemas.microsoft.com/office/drawing/2015/9/8/chartex" xmlns:cx2="http://schemas.microsoft.com/office/drawing/2015/10/21/chartex" xmlns:cx3="http://schemas.microsoft.com/office/drawing/2016/5/9/chartex" xmlns:cx4="http://schemas.microsoft.com/office/drawing/2016/5/10/chartex" xmlns:cx5="http://schemas.microsoft.com/office/drawing/2016/5/11/chartex" xmlns:cx6="http://schemas.microsoft.com/office/drawing/2016/5/12/chartex" xmlns:cx7="http://schemas.microsoft.com/office/drawing/2016/5/13/chartex" xmlns:cx8="http://schemas.microsoft.com/office/drawing/2016/5/14/chartex" xmlns:mc="http://schemas.openxmlformats.org/markup-compatibility/2006" xmlns:aink="http://schemas.microsoft.com/office/drawing/2016/ink" xmlns:am3d="http://schemas.microsoft.com/office/drawing/2017/model3d" xmlns:o="urn:schemas-microsoft-com:office:office" xmlns:oel="http://schemas.microsoft.com/office/2019/extlst" xmlns:r="http://schemas.openxmlformats.org/officeDocument/2006/relationships" xmlns:m="http://schemas.openxmlformats.org/officeDocument/2006/math" xmlns:v="urn:schemas-microsoft-com:vml" xmlns:wp14="http://schemas.microsoft.com/office/word/2010/wordprocessingDrawing" xmlns:wp="http://schemas.openxmlformats.org/drawingml/2006/wordprocessingDrawing" xmlns:w10="urn:schemas-microsoft-com:office:word" xmlns:w="http://schemas.openxmlformats.org/wordprocessingml/2006/main" xmlns:w14="http://schemas.microsoft.com/office/word/2010/wordml" xmlns:w15="http://schemas.microsoft.com/office/word/2012/wordml" xmlns:w16cex="http://schemas.microsoft.com/office/word/2018/wordml/cex" xmlns:w16cid="http://schemas.microsoft.com/office/word/2016/wordml/cid" xmlns:w16="http://schemas.microsoft.com/office/word/2018/wordml" xmlns:w16du="http://schemas.microsoft.com/office/word/2023/wordml/word16du" xmlns:w16sdtdh="http://schemas.microsoft.com/office/word/2020/wordml/sdtdatahash" xmlns:w16sdtfl="http://schemas.microsoft.com/office/word/2024/wordml/sdtformatlock" xmlns:w16se="http://schemas.microsoft.com/office/word/2015/wordml/symex" xmlns:wpg="http://schemas.microsoft.com/office/word/2010/wordprocessingGroup" xmlns:wpi="http://schemas.microsoft.com/office/word/2010/wordprocessingInk" xmlns:wne="http://schemas.microsoft.com/office/word/2006/wordml" xmlns:wps="http://schemas.microsoft.com/office/word/2010/wordprocessingShape" mc:Ignorable="w14 w15 w16se w16cid w16 w16cex w16sdtdh w16sdtfl w16du wp14">
+  <w:abstractNum w:abstractNumId="0" w15:restartNumberingAfterBreak="0">
+    <w:nsid w:val="23B91921"/>
+    <w:multiLevelType w:val="multilevel"/>
+    <w:tmpl w:val="82A8D280"/>
+    <w:lvl w:ilvl="0">
+      <w:start w:val="1"/>
+      <w:numFmt w:val="bullet"/>
+      <w:lvlText w:val=""/>
+      <w:lvlJc w:val="left"/>
+      <w:pPr>
+        <w:tabs>
+          <w:tab w:val="num" w:pos="720"/>
+        </w:tabs>
+        <w:ind w:left="720" w:hanging="360"/>
+      </w:pPr>
+      <w:rPr>
+        <w:rFonts w:ascii="Symbol" w:hAnsi="Symbol" w:hint="default"/>
+        <w:sz w:val="20"/>
+      </w:rPr>
+    </w:lvl>
+    <w:lvl w:ilvl="1" w:tentative="1">
+      <w:start w:val="1"/>
+      <w:numFmt w:val="bullet"/>
+      <w:lvlText w:val="o"/>
+      <w:lvlJc w:val="left"/>
+      <w:pPr>
+        <w:tabs>
+          <w:tab w:val="num" w:pos="1440"/>
+        </w:tabs>
+        <w:ind w:left="1440" w:hanging="360"/>
+      </w:pPr>
+      <w:rPr>
+        <w:rFonts w:ascii="Courier New" w:hAnsi="Courier New" w:hint="default"/>
+        <w:sz w:val="20"/>
+      </w:rPr>
+    </w:lvl>
+    <w:lvl w:ilvl="2" w:tentative="1">
+      <w:start w:val="1"/>
+      <w:numFmt w:val="bullet"/>
+      <w:lvlText w:val=""/>
+      <w:lvlJc w:val="left"/>
+      <w:pPr>
+        <w:tabs>
+          <w:tab w:val="num" w:pos="2160"/>
+        </w:tabs>
+        <w:ind w:left="2160" w:hanging="360"/>
+      </w:pPr>
+      <w:rPr>
+        <w:rFonts w:ascii="Wingdings" w:hAnsi="Wingdings" w:hint="default"/>
+        <w:sz w:val="20"/>
+      </w:rPr>
+    </w:lvl>
+    <w:lvl w:ilvl="3" w:tentative="1">
+      <w:start w:val="1"/>
+      <w:numFmt w:val="bullet"/>
+      <w:lvlText w:val=""/>
+      <w:lvlJc w:val="left"/>
+      <w:pPr>
+        <w:tabs>
+          <w:tab w:val="num" w:pos="2880"/>
+        </w:tabs>
+        <w:ind w:left="2880" w:hanging="360"/>
+      </w:pPr>
+      <w:rPr>
+        <w:rFonts w:ascii="Wingdings" w:hAnsi="Wingdings" w:hint="default"/>
+        <w:sz w:val="20"/>
+      </w:rPr>
+    </w:lvl>
+    <w:lvl w:ilvl="4" w:tentative="1">
+      <w:start w:val="1"/>
+      <w:numFmt w:val="bullet"/>
+      <w:lvlText w:val=""/>
+      <w:lvlJc w:val="left"/>
+      <w:pPr>
+        <w:tabs>
+          <w:tab w:val="num" w:pos="3600"/>
+        </w:tabs>
+        <w:ind w:left="3600" w:hanging="360"/>
+      </w:pPr>
+      <w:rPr>
+        <w:rFonts w:ascii="Wingdings" w:hAnsi="Wingdings" w:hint="default"/>
+        <w:sz w:val="20"/>
+      </w:rPr>
+    </w:lvl>
+    <w:lvl w:ilvl="5" w:tentative="1">
+      <w:start w:val="1"/>
+      <w:numFmt w:val="bullet"/>
+      <w:lvlText w:val=""/>
+      <w:lvlJc w:val="left"/>
+      <w:pPr>
+        <w:tabs>
+          <w:tab w:val="num" w:pos="4320"/>
+        </w:tabs>
+        <w:ind w:left="4320" w:hanging="360"/>
+      </w:pPr>
+      <w:rPr>
+        <w:rFonts w:ascii="Wingdings" w:hAnsi="Wingdings" w:hint="default"/>
+        <w:sz w:val="20"/>
+      </w:rPr>
+    </w:lvl>
+    <w:lvl w:ilvl="6" w:tentative="1">
+      <w:start w:val="1"/>
+      <w:numFmt w:val="bullet"/>
+      <w:lvlText w:val=""/>
+      <w:lvlJc w:val="left"/>
+      <w:pPr>
+        <w:tabs>
+          <w:tab w:val="num" w:pos="5040"/>
+        </w:tabs>
+        <w:ind w:left="5040" w:hanging="360"/>
+      </w:pPr>
+      <w:rPr>
+        <w:rFonts w:ascii="Wingdings" w:hAnsi="Wingdings" w:hint="default"/>
+        <w:sz w:val="20"/>
+      </w:rPr>
+    </w:lvl>
+    <w:lvl w:ilvl="7" w:tentative="1">
+      <w:start w:val="1"/>
+      <w:numFmt w:val="bullet"/>
+      <w:lvlText w:val=""/>
+      <w:lvlJc w:val="left"/>
+      <w:pPr>
+        <w:tabs>
+          <w:tab w:val="num" w:pos="5760"/>
+        </w:tabs>
+        <w:ind w:left="5760" w:hanging="360"/>
+      </w:pPr>
+      <w:rPr>
+        <w:rFonts w:ascii="Wingdings" w:hAnsi="Wingdings" w:hint="default"/>
+        <w:sz w:val="20"/>
+      </w:rPr>
+    </w:lvl>
+    <w:lvl w:ilvl="8" w:tentative="1">
+      <w:start w:val="1"/>
+      <w:numFmt w:val="bullet"/>
+      <w:lvlText w:val=""/>
+      <w:lvlJc w:val="left"/>
+      <w:pPr>
+        <w:tabs>
+          <w:tab w:val="num" w:pos="6480"/>
+        </w:tabs>
+        <w:ind w:left="6480" w:hanging="360"/>
+      </w:pPr>
+      <w:rPr>
+        <w:rFonts w:ascii="Wingdings" w:hAnsi="Wingdings" w:hint="default"/>
+        <w:sz w:val="20"/>
+      </w:rPr>
+    </w:lvl>
+  </w:abstractNum>
+  <w:abstractNum w:abstractNumId="1" w15:restartNumberingAfterBreak="0">
+    <w:nsid w:val="30126ADC"/>
+    <w:multiLevelType w:val="multilevel"/>
+    <w:tmpl w:val="A7620BEE"/>
+    <w:lvl w:ilvl="0">
+      <w:start w:val="1"/>
+      <w:numFmt w:val="bullet"/>
+      <w:lvlText w:val=""/>
+      <w:lvlJc w:val="left"/>
+      <w:pPr>
+        <w:tabs>
+          <w:tab w:val="num" w:pos="720"/>
+        </w:tabs>
+        <w:ind w:left="720" w:hanging="360"/>
+      </w:pPr>
+      <w:rPr>
+        <w:rFonts w:ascii="Symbol" w:hAnsi="Symbol" w:hint="default"/>
+        <w:sz w:val="20"/>
+      </w:rPr>
+    </w:lvl>
+    <w:lvl w:ilvl="1" w:tentative="1">
+      <w:start w:val="1"/>
+      <w:numFmt w:val="bullet"/>
+      <w:lvlText w:val="o"/>
+      <w:lvlJc w:val="left"/>
+      <w:pPr>
+        <w:tabs>
+          <w:tab w:val="num" w:pos="1440"/>
+        </w:tabs>
+        <w:ind w:left="1440" w:hanging="360"/>
+      </w:pPr>
+      <w:rPr>
+        <w:rFonts w:ascii="Courier New" w:hAnsi="Courier New" w:hint="default"/>
+        <w:sz w:val="20"/>
+      </w:rPr>
+    </w:lvl>
+    <w:lvl w:ilvl="2" w:tentative="1">
+      <w:start w:val="1"/>
+      <w:numFmt w:val="bullet"/>
+      <w:lvlText w:val=""/>
+      <w:lvlJc w:val="left"/>
+      <w:pPr>
+        <w:tabs>
+          <w:tab w:val="num" w:pos="2160"/>
+        </w:tabs>
+        <w:ind w:left="2160" w:hanging="360"/>
+      </w:pPr>
+      <w:rPr>
+        <w:rFonts w:ascii="Wingdings" w:hAnsi="Wingdings" w:hint="default"/>
+        <w:sz w:val="20"/>
+      </w:rPr>
+    </w:lvl>
+    <w:lvl w:ilvl="3" w:tentative="1">
+      <w:start w:val="1"/>
+      <w:numFmt w:val="bullet"/>
+      <w:lvlText w:val=""/>
+      <w:lvlJc w:val="left"/>
+      <w:pPr>
+        <w:tabs>
+          <w:tab w:val="num" w:pos="2880"/>
+        </w:tabs>
+        <w:ind w:left="2880" w:hanging="360"/>
+      </w:pPr>
+      <w:rPr>
+        <w:rFonts w:ascii="Wingdings" w:hAnsi="Wingdings" w:hint="default"/>
+        <w:sz w:val="20"/>
+      </w:rPr>
+    </w:lvl>
+    <w:lvl w:ilvl="4" w:tentative="1">
+      <w:start w:val="1"/>
+      <w:numFmt w:val="bullet"/>
+      <w:lvlText w:val=""/>
+      <w:lvlJc w:val="left"/>
+      <w:pPr>
+        <w:tabs>
+          <w:tab w:val="num" w:pos="3600"/>
+        </w:tabs>
+        <w:ind w:left="3600" w:hanging="360"/>
+      </w:pPr>
+      <w:rPr>
+        <w:rFonts w:ascii="Wingdings" w:hAnsi="Wingdings" w:hint="default"/>
+        <w:sz w:val="20"/>
+      </w:rPr>
+    </w:lvl>
+    <w:lvl w:ilvl="5" w:tentative="1">
+      <w:start w:val="1"/>
+      <w:numFmt w:val="bullet"/>
+      <w:lvlText w:val=""/>
+      <w:lvlJc w:val="left"/>
+      <w:pPr>
+        <w:tabs>
+          <w:tab w:val="num" w:pos="4320"/>
+        </w:tabs>
+        <w:ind w:left="4320" w:hanging="360"/>
+      </w:pPr>
+      <w:rPr>
+        <w:rFonts w:ascii="Wingdings" w:hAnsi="Wingdings" w:hint="default"/>
+        <w:sz w:val="20"/>
+      </w:rPr>
+    </w:lvl>
+    <w:lvl w:ilvl="6" w:tentative="1">
+      <w:start w:val="1"/>
+      <w:numFmt w:val="bullet"/>
+      <w:lvlText w:val=""/>
+      <w:lvlJc w:val="left"/>
+      <w:pPr>
+        <w:tabs>
+          <w:tab w:val="num" w:pos="5040"/>
+        </w:tabs>
+        <w:ind w:left="5040" w:hanging="360"/>
+      </w:pPr>
+      <w:rPr>
+        <w:rFonts w:ascii="Wingdings" w:hAnsi="Wingdings" w:hint="default"/>
+        <w:sz w:val="20"/>
+      </w:rPr>
+    </w:lvl>
+    <w:lvl w:ilvl="7" w:tentative="1">
+      <w:start w:val="1"/>
+      <w:numFmt w:val="bullet"/>
+      <w:lvlText w:val=""/>
+      <w:lvlJc w:val="left"/>
+      <w:pPr>
+        <w:tabs>
+          <w:tab w:val="num" w:pos="5760"/>
+        </w:tabs>
+        <w:ind w:left="5760" w:hanging="360"/>
+      </w:pPr>
+      <w:rPr>
+        <w:rFonts w:ascii="Wingdings" w:hAnsi="Wingdings" w:hint="default"/>
+        <w:sz w:val="20"/>
+      </w:rPr>
+    </w:lvl>
+    <w:lvl w:ilvl="8" w:tentative="1">
+      <w:start w:val="1"/>
+      <w:numFmt w:val="bullet"/>
+      <w:lvlText w:val=""/>
+      <w:lvlJc w:val="left"/>
+      <w:pPr>
+        <w:tabs>
+          <w:tab w:val="num" w:pos="6480"/>
+        </w:tabs>
+        <w:ind w:left="6480" w:hanging="360"/>
+      </w:pPr>
+      <w:rPr>
+        <w:rFonts w:ascii="Wingdings" w:hAnsi="Wingdings" w:hint="default"/>
+        <w:sz w:val="20"/>
+      </w:rPr>
+    </w:lvl>
+  </w:abstractNum>
+  <w:abstractNum w:abstractNumId="2" w15:restartNumberingAfterBreak="0">
+    <w:nsid w:val="407925AA"/>
+    <w:multiLevelType w:val="multilevel"/>
+    <w:tmpl w:val="47202242"/>
+    <w:lvl w:ilvl="0">
+      <w:start w:val="1"/>
+      <w:numFmt w:val="decimal"/>
+      <w:lvlText w:val="%1."/>
+      <w:lvlJc w:val="left"/>
+      <w:pPr>
+        <w:tabs>
+          <w:tab w:val="num" w:pos="720"/>
+        </w:tabs>
+        <w:ind w:left="720" w:hanging="360"/>
+      </w:pPr>
+    </w:lvl>
+    <w:lvl w:ilvl="1" w:tentative="1">
+      <w:start w:val="1"/>
+      <w:numFmt w:val="decimal"/>
+      <w:lvlText w:val="%2."/>
+      <w:lvlJc w:val="left"/>
+      <w:pPr>
+        <w:tabs>
+          <w:tab w:val="num" w:pos="1440"/>
+        </w:tabs>
+        <w:ind w:left="1440" w:hanging="360"/>
+      </w:pPr>
+    </w:lvl>
+    <w:lvl w:ilvl="2" w:tentative="1">
+      <w:start w:val="1"/>
+      <w:numFmt w:val="decimal"/>
+      <w:lvlText w:val="%3."/>
+      <w:lvlJc w:val="left"/>
+      <w:pPr>
+        <w:tabs>
+          <w:tab w:val="num" w:pos="2160"/>
+        </w:tabs>
+        <w:ind w:left="2160" w:hanging="360"/>
+      </w:pPr>
+    </w:lvl>
+    <w:lvl w:ilvl="3" w:tentative="1">
+      <w:start w:val="1"/>
+      <w:numFmt w:val="decimal"/>
+      <w:lvlText w:val="%4."/>
+      <w:lvlJc w:val="left"/>
+      <w:pPr>
+        <w:tabs>
+          <w:tab w:val="num" w:pos="2880"/>
+        </w:tabs>
+        <w:ind w:left="2880" w:hanging="360"/>
+      </w:pPr>
+    </w:lvl>
+    <w:lvl w:ilvl="4" w:tentative="1">
+      <w:start w:val="1"/>
+      <w:numFmt w:val="decimal"/>
+      <w:lvlText w:val="%5."/>
+      <w:lvlJc w:val="left"/>
+      <w:pPr>
+        <w:tabs>
+          <w:tab w:val="num" w:pos="3600"/>
+        </w:tabs>
+        <w:ind w:left="3600" w:hanging="360"/>
+      </w:pPr>
+    </w:lvl>
+    <w:lvl w:ilvl="5" w:tentative="1">
+      <w:start w:val="1"/>
+      <w:numFmt w:val="decimal"/>
+      <w:lvlText w:val="%6."/>
+      <w:lvlJc w:val="left"/>
+      <w:pPr>
+        <w:tabs>
+          <w:tab w:val="num" w:pos="4320"/>
+        </w:tabs>
+        <w:ind w:left="4320" w:hanging="360"/>
+      </w:pPr>
+    </w:lvl>
+    <w:lvl w:ilvl="6" w:tentative="1">
+      <w:start w:val="1"/>
+      <w:numFmt w:val="decimal"/>
+      <w:lvlText w:val="%7."/>
+      <w:lvlJc w:val="left"/>
+      <w:pPr>
+        <w:tabs>
+          <w:tab w:val="num" w:pos="5040"/>
+        </w:tabs>
+        <w:ind w:left="5040" w:hanging="360"/>
+      </w:pPr>
+    </w:lvl>
+    <w:lvl w:ilvl="7" w:tentative="1">
+      <w:start w:val="1"/>
+      <w:numFmt w:val="decimal"/>
+      <w:lvlText w:val="%8."/>
+      <w:lvlJc w:val="left"/>
+      <w:pPr>
+        <w:tabs>
+          <w:tab w:val="num" w:pos="5760"/>
+        </w:tabs>
+        <w:ind w:left="5760" w:hanging="360"/>
+      </w:pPr>
+    </w:lvl>
+    <w:lvl w:ilvl="8" w:tentative="1">
+      <w:start w:val="1"/>
+      <w:numFmt w:val="decimal"/>
+      <w:lvlText w:val="%9."/>
+      <w:lvlJc w:val="left"/>
+      <w:pPr>
+        <w:tabs>
+          <w:tab w:val="num" w:pos="6480"/>
+        </w:tabs>
+        <w:ind w:left="6480" w:hanging="360"/>
+      </w:pPr>
+    </w:lvl>
+  </w:abstractNum>
+  <w:abstractNum w:abstractNumId="3" w15:restartNumberingAfterBreak="0">
+    <w:nsid w:val="44FC3563"/>
+    <w:multiLevelType w:val="multilevel"/>
+    <w:tmpl w:val="AC32A544"/>
+    <w:lvl w:ilvl="0">
+      <w:start w:val="1"/>
+      <w:numFmt w:val="bullet"/>
+      <w:lvlText w:val=""/>
+      <w:lvlJc w:val="left"/>
+      <w:pPr>
+        <w:tabs>
+          <w:tab w:val="num" w:pos="720"/>
+        </w:tabs>
+        <w:ind w:left="720" w:hanging="360"/>
+      </w:pPr>
+      <w:rPr>
+        <w:rFonts w:ascii="Symbol" w:hAnsi="Symbol" w:hint="default"/>
+        <w:sz w:val="20"/>
+      </w:rPr>
+    </w:lvl>
+    <w:lvl w:ilvl="1" w:tentative="1">
+      <w:start w:val="1"/>
+      <w:numFmt w:val="bullet"/>
+      <w:lvlText w:val="o"/>
+      <w:lvlJc w:val="left"/>
+      <w:pPr>
+        <w:tabs>
+          <w:tab w:val="num" w:pos="1440"/>
+        </w:tabs>
+        <w:ind w:left="1440" w:hanging="360"/>
+      </w:pPr>
+      <w:rPr>
+        <w:rFonts w:ascii="Courier New" w:hAnsi="Courier New" w:hint="default"/>
+        <w:sz w:val="20"/>
+      </w:rPr>
+    </w:lvl>
+    <w:lvl w:ilvl="2" w:tentative="1">
+      <w:start w:val="1"/>
+      <w:numFmt w:val="bullet"/>
+      <w:lvlText w:val=""/>
+      <w:lvlJc w:val="left"/>
+      <w:pPr>
+        <w:tabs>
+          <w:tab w:val="num" w:pos="2160"/>
+        </w:tabs>
+        <w:ind w:left="2160" w:hanging="360"/>
+      </w:pPr>
+      <w:rPr>
+        <w:rFonts w:ascii="Wingdings" w:hAnsi="Wingdings" w:hint="default"/>
+        <w:sz w:val="20"/>
+      </w:rPr>
+    </w:lvl>
+    <w:lvl w:ilvl="3" w:tentative="1">
+      <w:start w:val="1"/>
+      <w:numFmt w:val="bullet"/>
+      <w:lvlText w:val=""/>
+      <w:lvlJc w:val="left"/>
+      <w:pPr>
+        <w:tabs>
+          <w:tab w:val="num" w:pos="2880"/>
+        </w:tabs>
+        <w:ind w:left="2880" w:hanging="360"/>
+      </w:pPr>
+      <w:rPr>
+        <w:rFonts w:ascii="Wingdings" w:hAnsi="Wingdings" w:hint="default"/>
+        <w:sz w:val="20"/>
+      </w:rPr>
+    </w:lvl>
+    <w:lvl w:ilvl="4" w:tentative="1">
+      <w:start w:val="1"/>
+      <w:numFmt w:val="bullet"/>
+      <w:lvlText w:val=""/>
+      <w:lvlJc w:val="left"/>
+      <w:pPr>
+        <w:tabs>
+          <w:tab w:val="num" w:pos="3600"/>
+        </w:tabs>
+        <w:ind w:left="3600" w:hanging="360"/>
+      </w:pPr>
+      <w:rPr>
+        <w:rFonts w:ascii="Wingdings" w:hAnsi="Wingdings" w:hint="default"/>
+        <w:sz w:val="20"/>
+      </w:rPr>
+    </w:lvl>
+    <w:lvl w:ilvl="5" w:tentative="1">
+      <w:start w:val="1"/>
+      <w:numFmt w:val="bullet"/>
+      <w:lvlText w:val=""/>
+      <w:lvlJc w:val="left"/>
+      <w:pPr>
+        <w:tabs>
+          <w:tab w:val="num" w:pos="4320"/>
+        </w:tabs>
+        <w:ind w:left="4320" w:hanging="360"/>
+      </w:pPr>
+      <w:rPr>
+        <w:rFonts w:ascii="Wingdings" w:hAnsi="Wingdings" w:hint="default"/>
+        <w:sz w:val="20"/>
+      </w:rPr>
+    </w:lvl>
+    <w:lvl w:ilvl="6" w:tentative="1">
+      <w:start w:val="1"/>
+      <w:numFmt w:val="bullet"/>
+      <w:lvlText w:val=""/>
+      <w:lvlJc w:val="left"/>
+      <w:pPr>
+        <w:tabs>
+          <w:tab w:val="num" w:pos="5040"/>
+        </w:tabs>
+        <w:ind w:left="5040" w:hanging="360"/>
+      </w:pPr>
+      <w:rPr>
+        <w:rFonts w:ascii="Wingdings" w:hAnsi="Wingdings" w:hint="default"/>
+        <w:sz w:val="20"/>
+      </w:rPr>
+    </w:lvl>
+    <w:lvl w:ilvl="7" w:tentative="1">
+      <w:start w:val="1"/>
+      <w:numFmt w:val="bullet"/>
+      <w:lvlText w:val=""/>
+      <w:lvlJc w:val="left"/>
+      <w:pPr>
+        <w:tabs>
+          <w:tab w:val="num" w:pos="5760"/>
+        </w:tabs>
+        <w:ind w:left="5760" w:hanging="360"/>
+      </w:pPr>
+      <w:rPr>
+        <w:rFonts w:ascii="Wingdings" w:hAnsi="Wingdings" w:hint="default"/>
+        <w:sz w:val="20"/>
+      </w:rPr>
+    </w:lvl>
+    <w:lvl w:ilvl="8" w:tentative="1">
+      <w:start w:val="1"/>
+      <w:numFmt w:val="bullet"/>
+      <w:lvlText w:val=""/>
+      <w:lvlJc w:val="left"/>
+      <w:pPr>
+        <w:tabs>
+          <w:tab w:val="num" w:pos="6480"/>
+        </w:tabs>
+        <w:ind w:left="6480" w:hanging="360"/>
+      </w:pPr>
+      <w:rPr>
+        <w:rFonts w:ascii="Wingdings" w:hAnsi="Wingdings" w:hint="default"/>
+        <w:sz w:val="20"/>
+      </w:rPr>
+    </w:lvl>
+  </w:abstractNum>
+  <w:abstractNum w:abstractNumId="4" w15:restartNumberingAfterBreak="0">
+    <w:nsid w:val="5B411392"/>
+    <w:multiLevelType w:val="multilevel"/>
+    <w:tmpl w:val="178EFCBA"/>
+    <w:lvl w:ilvl="0">
+      <w:start w:val="1"/>
+      <w:numFmt w:val="bullet"/>
+      <w:lvlText w:val=""/>
+      <w:lvlJc w:val="left"/>
+      <w:pPr>
+        <w:tabs>
+          <w:tab w:val="num" w:pos="720"/>
+        </w:tabs>
+        <w:ind w:left="720" w:hanging="360"/>
+      </w:pPr>
+      <w:rPr>
+        <w:rFonts w:ascii="Symbol" w:hAnsi="Symbol" w:hint="default"/>
+        <w:sz w:val="20"/>
+      </w:rPr>
+    </w:lvl>
+    <w:lvl w:ilvl="1" w:tentative="1">
+      <w:start w:val="1"/>
+      <w:numFmt w:val="bullet"/>
+      <w:lvlText w:val="o"/>
+      <w:lvlJc w:val="left"/>
+      <w:pPr>
+        <w:tabs>
+          <w:tab w:val="num" w:pos="1440"/>
+        </w:tabs>
+        <w:ind w:left="1440" w:hanging="360"/>
+      </w:pPr>
+      <w:rPr>
+        <w:rFonts w:ascii="Courier New" w:hAnsi="Courier New" w:hint="default"/>
+        <w:sz w:val="20"/>
+      </w:rPr>
+    </w:lvl>
+    <w:lvl w:ilvl="2" w:tentative="1">
+      <w:start w:val="1"/>
+      <w:numFmt w:val="bullet"/>
+      <w:lvlText w:val=""/>
+      <w:lvlJc w:val="left"/>
+      <w:pPr>
+        <w:tabs>
+          <w:tab w:val="num" w:pos="2160"/>
+        </w:tabs>
+        <w:ind w:left="2160" w:hanging="360"/>
+      </w:pPr>
+      <w:rPr>
+        <w:rFonts w:ascii="Wingdings" w:hAnsi="Wingdings" w:hint="default"/>
+        <w:sz w:val="20"/>
+      </w:rPr>
+    </w:lvl>
+    <w:lvl w:ilvl="3" w:tentative="1">
+      <w:start w:val="1"/>
+      <w:numFmt w:val="bullet"/>
+      <w:lvlText w:val=""/>
+      <w:lvlJc w:val="left"/>
+      <w:pPr>
+        <w:tabs>
+          <w:tab w:val="num" w:pos="2880"/>
+        </w:tabs>
+        <w:ind w:left="2880" w:hanging="360"/>
+      </w:pPr>
+      <w:rPr>
+        <w:rFonts w:ascii="Wingdings" w:hAnsi="Wingdings" w:hint="default"/>
+        <w:sz w:val="20"/>
+      </w:rPr>
+    </w:lvl>
+    <w:lvl w:ilvl="4" w:tentative="1">
+      <w:start w:val="1"/>
+      <w:numFmt w:val="bullet"/>
+      <w:lvlText w:val=""/>
+      <w:lvlJc w:val="left"/>
+      <w:pPr>
+        <w:tabs>
+          <w:tab w:val="num" w:pos="3600"/>
+        </w:tabs>
+        <w:ind w:left="3600" w:hanging="360"/>
+      </w:pPr>
+      <w:rPr>
+        <w:rFonts w:ascii="Wingdings" w:hAnsi="Wingdings" w:hint="default"/>
+        <w:sz w:val="20"/>
+      </w:rPr>
+    </w:lvl>
+    <w:lvl w:ilvl="5" w:tentative="1">
+      <w:start w:val="1"/>
+      <w:numFmt w:val="bullet"/>
+      <w:lvlText w:val=""/>
+      <w:lvlJc w:val="left"/>
+      <w:pPr>
+        <w:tabs>
+          <w:tab w:val="num" w:pos="4320"/>
+        </w:tabs>
+        <w:ind w:left="4320" w:hanging="360"/>
+      </w:pPr>
+      <w:rPr>
+        <w:rFonts w:ascii="Wingdings" w:hAnsi="Wingdings" w:hint="default"/>
+        <w:sz w:val="20"/>
+      </w:rPr>
+    </w:lvl>
+    <w:lvl w:ilvl="6" w:tentative="1">
+      <w:start w:val="1"/>
+      <w:numFmt w:val="bullet"/>
+      <w:lvlText w:val=""/>
+      <w:lvlJc w:val="left"/>
+      <w:pPr>
+        <w:tabs>
+          <w:tab w:val="num" w:pos="5040"/>
+        </w:tabs>
+        <w:ind w:left="5040" w:hanging="360"/>
+      </w:pPr>
+      <w:rPr>
+        <w:rFonts w:ascii="Wingdings" w:hAnsi="Wingdings" w:hint="default"/>
+        <w:sz w:val="20"/>
+      </w:rPr>
+    </w:lvl>
+    <w:lvl w:ilvl="7" w:tentative="1">
+      <w:start w:val="1"/>
+      <w:numFmt w:val="bullet"/>
+      <w:lvlText w:val=""/>
+      <w:lvlJc w:val="left"/>
+      <w:pPr>
+        <w:tabs>
+          <w:tab w:val="num" w:pos="5760"/>
+        </w:tabs>
+        <w:ind w:left="5760" w:hanging="360"/>
+      </w:pPr>
+      <w:rPr>
+        <w:rFonts w:ascii="Wingdings" w:hAnsi="Wingdings" w:hint="default"/>
+        <w:sz w:val="20"/>
+      </w:rPr>
+    </w:lvl>
+    <w:lvl w:ilvl="8" w:tentative="1">
+      <w:start w:val="1"/>
+      <w:numFmt w:val="bullet"/>
+      <w:lvlText w:val=""/>
+      <w:lvlJc w:val="left"/>
+      <w:pPr>
+        <w:tabs>
+          <w:tab w:val="num" w:pos="6480"/>
+        </w:tabs>
+        <w:ind w:left="6480" w:hanging="360"/>
+      </w:pPr>
+      <w:rPr>
+        <w:rFonts w:ascii="Wingdings" w:hAnsi="Wingdings" w:hint="default"/>
+        <w:sz w:val="20"/>
+      </w:rPr>
+    </w:lvl>
+  </w:abstractNum>
+  <w:abstractNum w:abstractNumId="5" w15:restartNumberingAfterBreak="0">
+    <w:nsid w:val="71807A61"/>
+    <w:multiLevelType w:val="multilevel"/>
+    <w:tmpl w:val="3A0E9DE2"/>
+    <w:lvl w:ilvl="0">
+      <w:start w:val="1"/>
+      <w:numFmt w:val="bullet"/>
+      <w:lvlText w:val=""/>
+      <w:lvlJc w:val="left"/>
+      <w:pPr>
+        <w:tabs>
+          <w:tab w:val="num" w:pos="720"/>
+        </w:tabs>
+        <w:ind w:left="720" w:hanging="360"/>
+      </w:pPr>
+      <w:rPr>
+        <w:rFonts w:ascii="Symbol" w:hAnsi="Symbol" w:hint="default"/>
+        <w:sz w:val="20"/>
+      </w:rPr>
+    </w:lvl>
+    <w:lvl w:ilvl="1" w:tentative="1">
+      <w:start w:val="1"/>
+      <w:numFmt w:val="bullet"/>
+      <w:lvlText w:val="o"/>
+      <w:lvlJc w:val="left"/>
+      <w:pPr>
+        <w:tabs>
+          <w:tab w:val="num" w:pos="1440"/>
+        </w:tabs>
+        <w:ind w:left="1440" w:hanging="360"/>
+      </w:pPr>
+      <w:rPr>
+        <w:rFonts w:ascii="Courier New" w:hAnsi="Courier New" w:hint="default"/>
+        <w:sz w:val="20"/>
+      </w:rPr>
+    </w:lvl>
+    <w:lvl w:ilvl="2" w:tentative="1">
+      <w:start w:val="1"/>
+      <w:numFmt w:val="bullet"/>
+      <w:lvlText w:val=""/>
+      <w:lvlJc w:val="left"/>
+      <w:pPr>
+        <w:tabs>
+          <w:tab w:val="num" w:pos="2160"/>
+        </w:tabs>
+        <w:ind w:left="2160" w:hanging="360"/>
+      </w:pPr>
+      <w:rPr>
+        <w:rFonts w:ascii="Wingdings" w:hAnsi="Wingdings" w:hint="default"/>
+        <w:sz w:val="20"/>
+      </w:rPr>
+    </w:lvl>
+    <w:lvl w:ilvl="3" w:tentative="1">
+      <w:start w:val="1"/>
+      <w:numFmt w:val="bullet"/>
+      <w:lvlText w:val=""/>
+      <w:lvlJc w:val="left"/>
+      <w:pPr>
+        <w:tabs>
+          <w:tab w:val="num" w:pos="2880"/>
+        </w:tabs>
+        <w:ind w:left="2880" w:hanging="360"/>
+      </w:pPr>
+      <w:rPr>
+        <w:rFonts w:ascii="Wingdings" w:hAnsi="Wingdings" w:hint="default"/>
+        <w:sz w:val="20"/>
+      </w:rPr>
+    </w:lvl>
+    <w:lvl w:ilvl="4" w:tentative="1">
+      <w:start w:val="1"/>
+      <w:numFmt w:val="bullet"/>
+      <w:lvlText w:val=""/>
+      <w:lvlJc w:val="left"/>
+      <w:pPr>
+        <w:tabs>
+          <w:tab w:val="num" w:pos="3600"/>
+        </w:tabs>
+        <w:ind w:left="3600" w:hanging="360"/>
+      </w:pPr>
+      <w:rPr>
+        <w:rFonts w:ascii="Wingdings" w:hAnsi="Wingdings" w:hint="default"/>
+        <w:sz w:val="20"/>
+      </w:rPr>
+    </w:lvl>
+    <w:lvl w:ilvl="5" w:tentative="1">
+      <w:start w:val="1"/>
+      <w:numFmt w:val="bullet"/>
+      <w:lvlText w:val=""/>
+      <w:lvlJc w:val="left"/>
+      <w:pPr>
+        <w:tabs>
+          <w:tab w:val="num" w:pos="4320"/>
+        </w:tabs>
+        <w:ind w:left="4320" w:hanging="360"/>
+      </w:pPr>
+      <w:rPr>
+        <w:rFonts w:ascii="Wingdings" w:hAnsi="Wingdings" w:hint="default"/>
+        <w:sz w:val="20"/>
+      </w:rPr>
+    </w:lvl>
+    <w:lvl w:ilvl="6" w:tentative="1">
+      <w:start w:val="1"/>
+      <w:numFmt w:val="bullet"/>
+      <w:lvlText w:val=""/>
+      <w:lvlJc w:val="left"/>
+      <w:pPr>
+        <w:tabs>
+          <w:tab w:val="num" w:pos="5040"/>
+        </w:tabs>
+        <w:ind w:left="5040" w:hanging="360"/>
+      </w:pPr>
+      <w:rPr>
+        <w:rFonts w:ascii="Wingdings" w:hAnsi="Wingdings" w:hint="default"/>
+        <w:sz w:val="20"/>
+      </w:rPr>
+    </w:lvl>
+    <w:lvl w:ilvl="7" w:tentative="1">
+      <w:start w:val="1"/>
+      <w:numFmt w:val="bullet"/>
+      <w:lvlText w:val=""/>
+      <w:lvlJc w:val="left"/>
+      <w:pPr>
+        <w:tabs>
+          <w:tab w:val="num" w:pos="5760"/>
+        </w:tabs>
+        <w:ind w:left="5760" w:hanging="360"/>
+      </w:pPr>
+      <w:rPr>
+        <w:rFonts w:ascii="Wingdings" w:hAnsi="Wingdings" w:hint="default"/>
+        <w:sz w:val="20"/>
+      </w:rPr>
+    </w:lvl>
+    <w:lvl w:ilvl="8" w:tentative="1">
+      <w:start w:val="1"/>
+      <w:numFmt w:val="bullet"/>
+      <w:lvlText w:val=""/>
+      <w:lvlJc w:val="left"/>
+      <w:pPr>
+        <w:tabs>
+          <w:tab w:val="num" w:pos="6480"/>
+        </w:tabs>
+        <w:ind w:left="6480" w:hanging="360"/>
+      </w:pPr>
+      <w:rPr>
+        <w:rFonts w:ascii="Wingdings" w:hAnsi="Wingdings" w:hint="default"/>
+        <w:sz w:val="20"/>
+      </w:rPr>
+    </w:lvl>
+  </w:abstractNum>
+  <w:abstractNum w:abstractNumId="6" w15:restartNumberingAfterBreak="0">
+    <w:nsid w:val="780B1895"/>
+    <w:multiLevelType w:val="multilevel"/>
+    <w:tmpl w:val="A59281EA"/>
+    <w:lvl w:ilvl="0">
+      <w:start w:val="1"/>
+      <w:numFmt w:val="bullet"/>
+      <w:lvlText w:val=""/>
+      <w:lvlJc w:val="left"/>
+      <w:pPr>
+        <w:tabs>
+          <w:tab w:val="num" w:pos="720"/>
+        </w:tabs>
+        <w:ind w:left="720" w:hanging="360"/>
+      </w:pPr>
+      <w:rPr>
+        <w:rFonts w:ascii="Symbol" w:hAnsi="Symbol" w:hint="default"/>
+        <w:sz w:val="20"/>
+      </w:rPr>
+    </w:lvl>
+    <w:lvl w:ilvl="1" w:tentative="1">
+      <w:start w:val="1"/>
+      <w:numFmt w:val="bullet"/>
+      <w:lvlText w:val="o"/>
+      <w:lvlJc w:val="left"/>
+      <w:pPr>
+        <w:tabs>
+          <w:tab w:val="num" w:pos="1440"/>
+        </w:tabs>
+        <w:ind w:left="1440" w:hanging="360"/>
+      </w:pPr>
+      <w:rPr>
+        <w:rFonts w:ascii="Courier New" w:hAnsi="Courier New" w:hint="default"/>
+        <w:sz w:val="20"/>
+      </w:rPr>
+    </w:lvl>
+    <w:lvl w:ilvl="2" w:tentative="1">
+      <w:start w:val="1"/>
+      <w:numFmt w:val="bullet"/>
+      <w:lvlText w:val=""/>
+      <w:lvlJc w:val="left"/>
+      <w:pPr>
+        <w:tabs>
+          <w:tab w:val="num" w:pos="2160"/>
+        </w:tabs>
+        <w:ind w:left="2160" w:hanging="360"/>
+      </w:pPr>
+      <w:rPr>
+        <w:rFonts w:ascii="Wingdings" w:hAnsi="Wingdings" w:hint="default"/>
+        <w:sz w:val="20"/>
+      </w:rPr>
+    </w:lvl>
+    <w:lvl w:ilvl="3" w:tentative="1">
+      <w:start w:val="1"/>
+      <w:numFmt w:val="bullet"/>
+      <w:lvlText w:val=""/>
+      <w:lvlJc w:val="left"/>
+      <w:pPr>
+        <w:tabs>
+          <w:tab w:val="num" w:pos="2880"/>
+        </w:tabs>
+        <w:ind w:left="2880" w:hanging="360"/>
+      </w:pPr>
+      <w:rPr>
+        <w:rFonts w:ascii="Wingdings" w:hAnsi="Wingdings" w:hint="default"/>
+        <w:sz w:val="20"/>
+      </w:rPr>
+    </w:lvl>
+    <w:lvl w:ilvl="4" w:tentative="1">
+      <w:start w:val="1"/>
+      <w:numFmt w:val="bullet"/>
+      <w:lvlText w:val=""/>
+      <w:lvlJc w:val="left"/>
+      <w:pPr>
+        <w:tabs>
+          <w:tab w:val="num" w:pos="3600"/>
+        </w:tabs>
+        <w:ind w:left="3600" w:hanging="360"/>
+      </w:pPr>
+      <w:rPr>
+        <w:rFonts w:ascii="Wingdings" w:hAnsi="Wingdings" w:hint="default"/>
+        <w:sz w:val="20"/>
+      </w:rPr>
+    </w:lvl>
+    <w:lvl w:ilvl="5" w:tentative="1">
+      <w:start w:val="1"/>
+      <w:numFmt w:val="bullet"/>
+      <w:lvlText w:val=""/>
+      <w:lvlJc w:val="left"/>
+      <w:pPr>
+        <w:tabs>
+          <w:tab w:val="num" w:pos="4320"/>
+        </w:tabs>
+        <w:ind w:left="4320" w:hanging="360"/>
+      </w:pPr>
+      <w:rPr>
+        <w:rFonts w:ascii="Wingdings" w:hAnsi="Wingdings" w:hint="default"/>
+        <w:sz w:val="20"/>
+      </w:rPr>
+    </w:lvl>
+    <w:lvl w:ilvl="6" w:tentative="1">
+      <w:start w:val="1"/>
+      <w:numFmt w:val="bullet"/>
+      <w:lvlText w:val=""/>
+      <w:lvlJc w:val="left"/>
+      <w:pPr>
+        <w:tabs>
+          <w:tab w:val="num" w:pos="5040"/>
+        </w:tabs>
+        <w:ind w:left="5040" w:hanging="360"/>
+      </w:pPr>
+      <w:rPr>
+        <w:rFonts w:ascii="Wingdings" w:hAnsi="Wingdings" w:hint="default"/>
+        <w:sz w:val="20"/>
+      </w:rPr>
+    </w:lvl>
+    <w:lvl w:ilvl="7" w:tentative="1">
+      <w:start w:val="1"/>
+      <w:numFmt w:val="bullet"/>
+      <w:lvlText w:val=""/>
+      <w:lvlJc w:val="left"/>
+      <w:pPr>
+        <w:tabs>
+          <w:tab w:val="num" w:pos="5760"/>
+        </w:tabs>
+        <w:ind w:left="5760" w:hanging="360"/>
+      </w:pPr>
+      <w:rPr>
+        <w:rFonts w:ascii="Wingdings" w:hAnsi="Wingdings" w:hint="default"/>
+        <w:sz w:val="20"/>
+      </w:rPr>
+    </w:lvl>
+    <w:lvl w:ilvl="8" w:tentative="1">
+      <w:start w:val="1"/>
+      <w:numFmt w:val="bullet"/>
+      <w:lvlText w:val=""/>
+      <w:lvlJc w:val="left"/>
+      <w:pPr>
+        <w:tabs>
+          <w:tab w:val="num" w:pos="6480"/>
+        </w:tabs>
+        <w:ind w:left="6480" w:hanging="360"/>
+      </w:pPr>
+      <w:rPr>
+        <w:rFonts w:ascii="Wingdings" w:hAnsi="Wingdings" w:hint="default"/>
+        <w:sz w:val="20"/>
+      </w:rPr>
+    </w:lvl>
+  </w:abstractNum>
+  <w:abstractNum w:abstractNumId="7" w15:restartNumberingAfterBreak="0">
+    <w:nsid w:val="7ACA6EFF"/>
+    <w:multiLevelType w:val="hybridMultilevel"/>
+    <w:tmpl w:val="184A27A4"/>
+    <w:lvl w:ilvl="0" w:tplc="4296FE98">
+      <w:start w:val="1"/>
+      <w:numFmt w:val="bullet"/>
+      <w:lvlText w:val="•"/>
+      <w:lvlJc w:val="left"/>
+      <w:pPr>
+        <w:ind w:left="720" w:hanging="360"/>
+      </w:pPr>
+    </w:lvl>
+    <w:lvl w:ilvl="1" w:tplc="B44ECA82">
+      <w:numFmt w:val="decimal"/>
+      <w:lvlText w:val=""/>
+      <w:lvlJc w:val="left"/>
+    </w:lvl>
+    <w:lvl w:ilvl="2" w:tplc="87681138">
+      <w:numFmt w:val="decimal"/>
+      <w:lvlText w:val=""/>
+      <w:lvlJc w:val="left"/>
+    </w:lvl>
+    <w:lvl w:ilvl="3" w:tplc="CE203434">
+      <w:numFmt w:val="decimal"/>
+      <w:lvlText w:val=""/>
+      <w:lvlJc w:val="left"/>
+    </w:lvl>
+    <w:lvl w:ilvl="4" w:tplc="3FA283CC">
+      <w:numFmt w:val="decimal"/>
+      <w:lvlText w:val=""/>
+      <w:lvlJc w:val="left"/>
+    </w:lvl>
+    <w:lvl w:ilvl="5" w:tplc="A6D84CD0">
+      <w:numFmt w:val="decimal"/>
+      <w:lvlText w:val=""/>
+      <w:lvlJc w:val="left"/>
+    </w:lvl>
+    <w:lvl w:ilvl="6" w:tplc="1FF0BF6A">
+      <w:numFmt w:val="decimal"/>
+      <w:lvlText w:val=""/>
+      <w:lvlJc w:val="left"/>
+    </w:lvl>
+    <w:lvl w:ilvl="7" w:tplc="EFEE42AE">
+      <w:numFmt w:val="decimal"/>
+      <w:lvlText w:val=""/>
+      <w:lvlJc w:val="left"/>
+    </w:lvl>
+    <w:lvl w:ilvl="8" w:tplc="63D8CE8C">
+      <w:numFmt w:val="decimal"/>
+      <w:lvlText w:val=""/>
+      <w:lvlJc w:val="left"/>
+    </w:lvl>
+  </w:abstractNum>
+  <w:num w:numId="1" w16cid:durableId="217203133">
+    <w:abstractNumId w:val="1"/>
+  </w:num>
+  <w:num w:numId="2" w16cid:durableId="163322013">
+    <w:abstractNumId w:val="0"/>
+  </w:num>
+  <w:num w:numId="3" w16cid:durableId="761220150">
+    <w:abstractNumId w:val="5"/>
+  </w:num>
+  <w:num w:numId="4" w16cid:durableId="1163811030">
+    <w:abstractNumId w:val="6"/>
+  </w:num>
+  <w:num w:numId="5" w16cid:durableId="389504127">
+    <w:abstractNumId w:val="4"/>
+  </w:num>
+  <w:num w:numId="6" w16cid:durableId="1235898861">
+    <w:abstractNumId w:val="2"/>
+  </w:num>
+  <w:num w:numId="7" w16cid:durableId="1275282315">
+    <w:abstractNumId w:val="3"/>
+  </w:num>
+  <w:num w:numId="8" w16cid:durableId="699167122">
+    <w:abstractNumId w:val="7"/>
+    <w:lvlOverride w:ilvl="0">
+      <w:startOverride w:val="1"/>
+    </w:lvlOverride>
+  </w:num>
+</w:numbering>
 </file>
 
 <file path=word/styles.xml><?xml version="1.0" encoding="utf-8"?>
@@ -1156,7 +3447,7 @@
     <w:lsdException w:name="Medium Shading 2 Accent 1" w:uiPriority="64"/>
     <w:lsdException w:name="Medium List 1 Accent 1" w:uiPriority="65"/>
     <w:lsdException w:name="Revision" w:semiHidden="1"/>
-    <w:lsdException w:name="List Paragraph" w:uiPriority="34" w:qFormat="1"/>
+    <w:lsdException w:name="List Paragraph" w:uiPriority="0" w:qFormat="1"/>
     <w:lsdException w:name="Quote" w:uiPriority="29" w:qFormat="1"/>
     <w:lsdException w:name="Intense Quote" w:uiPriority="30" w:qFormat="1"/>
     <w:lsdException w:name="Medium List 2 Accent 1" w:uiPriority="66"/>
@@ -1385,7 +3676,6 @@
     <w:next w:val="Normal"/>
     <w:link w:val="Heading2Char"/>
     <w:uiPriority w:val="9"/>
-    <w:semiHidden/>
     <w:unhideWhenUsed/>
     <w:qFormat/>
     <w:rsid w:val="00A24A47"/>
@@ -1560,7 +3850,6 @@
   <w:style w:type="character" w:default="1" w:styleId="DefaultParagraphFont">
     <w:name w:val="Default Paragraph Font"/>
     <w:uiPriority w:val="1"/>
-    <w:semiHidden/>
     <w:unhideWhenUsed/>
   </w:style>
   <w:style w:type="table" w:default="1" w:styleId="TableNormal">
@@ -1805,7 +4094,6 @@
   <w:style w:type="paragraph" w:styleId="ListParagraph">
     <w:name w:val="List Paragraph"/>
     <w:basedOn w:val="Normal"/>
-    <w:uiPriority w:val="34"/>
     <w:qFormat/>
     <w:rsid w:val="00A24A47"/>
     <w:pPr>

</xml_diff>